<commit_message>
Simplify report writing, remove hyphens, remove blue from headings and tables
</commit_message>
<xml_diff>
--- a/assignments/assignment-2/HW2_Document.docx
+++ b/assignments/assignment-2/HW2_Document.docx
@@ -12,7 +12,7 @@
     </w:p>
     <w:p>
       <w:r>
-        <w:t>Embedding-based transfer learning on IMDB reviews, a Retrieval-Augmented Generation pipeline over 10 movie Wikipedia pages, and five training-time optimization techniques.</w:t>
+        <w:t>Embedding transfer learning on IMDB reviews, a Retrieval Augmented Generation pipeline over 10 movie Wikipedia pages, and five training time optimization techniques.</w:t>
       </w:r>
     </w:p>
     <w:p>
@@ -20,7 +20,7 @@
         <w:pStyle w:val="Heading1"/>
       </w:pPr>
       <w:r>
-        <w:t>1. Embedding-Based Transfer Learning (IMDB Reviews)</w:t>
+        <w:t>1. Embedding Transfer Learning (IMDB Reviews)</w:t>
       </w:r>
     </w:p>
     <w:p>
@@ -33,7 +33,7 @@
     </w:p>
     <w:p>
       <w:r>
-        <w:t>Pretrained model: word2vec-google-news-300 (3,000,000 words, 300 dimensions), loaded with gensim's KeyedVectors. Fine-tuning corpus: 15,000 reviews randomly sampled from the IMDB Movie Reviews dataset (stanfordnlp/imdb, train + unsupervised splits, 75,000 reviews available total), cleaned of HTML line breaks and tokenized with gensim's simple_preprocess. A new gensim Word2Vec model (skip-gram, 300 dimensions) was built over the IMDB vocabulary, every word shared with the pretrained vocabulary was initialized with its pretrained vector (20,040 of 22,723 IMDB-vocab words matched), and training continued for 5 epochs on the IMDB corpus.</w:t>
+        <w:t>Pretrained model: word2vec-google-news-300 (3,000,000 words, 300 dimensions), loaded with gensim. Finetuning data: 15,000 reviews sampled from the IMDB Movie Reviews dataset (stanfordnlp/imdb), cleaned of HTML tags and tokenized with gensim simple_preprocess. A new gensim Word2Vec model (skip gram, 300 dimensions) was built on the IMDB vocabulary. Words shared with the pretrained vocabulary were initialized with their pretrained vectors (20,040 of 22,723 words matched), then trained for 5 epochs on the IMDB corpus.</w:t>
       </w:r>
     </w:p>
     <w:p>
@@ -41,7 +41,7 @@
         <w:pStyle w:val="Heading2"/>
       </w:pPr>
       <w:r>
-        <w:t>1.2 Top-3 nearest neighbors before fine-tuning</w:t>
+        <w:t>1.2 Top 3 nearest neighbors before finetuning</w:t>
       </w:r>
     </w:p>
     <w:tbl>
@@ -73,6 +73,7 @@
             <w:r>
               <w:rPr>
                 <w:b/>
+                <w:color w:val="000000"/>
                 <w:sz w:val="19"/>
               </w:rPr>
               <w:t>Word</w:t>
@@ -88,6 +89,7 @@
             <w:r>
               <w:rPr>
                 <w:b/>
+                <w:color w:val="000000"/>
                 <w:sz w:val="19"/>
               </w:rPr>
               <w:t>Rank</w:t>
@@ -103,6 +105,7 @@
             <w:r>
               <w:rPr>
                 <w:b/>
+                <w:color w:val="000000"/>
                 <w:sz w:val="19"/>
               </w:rPr>
               <w:t>Neighbor</w:t>
@@ -118,6 +121,7 @@
             <w:r>
               <w:rPr>
                 <w:b/>
+                <w:color w:val="000000"/>
                 <w:sz w:val="19"/>
               </w:rPr>
               <w:t>Cosine similarity</w:t>
@@ -133,6 +137,7 @@
           <w:p>
             <w:r>
               <w:rPr>
+                <w:color w:val="000000"/>
                 <w:sz w:val="19"/>
               </w:rPr>
               <w:t>cast</w:t>
@@ -146,6 +151,7 @@
           <w:p>
             <w:r>
               <w:rPr>
+                <w:color w:val="000000"/>
                 <w:sz w:val="19"/>
               </w:rPr>
               <w:t>1</w:t>
@@ -159,6 +165,7 @@
           <w:p>
             <w:r>
               <w:rPr>
+                <w:color w:val="000000"/>
                 <w:sz w:val="19"/>
               </w:rPr>
               <w:t>casts</w:t>
@@ -172,6 +179,7 @@
           <w:p>
             <w:r>
               <w:rPr>
+                <w:color w:val="000000"/>
                 <w:sz w:val="19"/>
               </w:rPr>
               <w:t>0.7219</w:t>
@@ -187,6 +195,7 @@
           <w:p>
             <w:r>
               <w:rPr>
+                <w:color w:val="000000"/>
                 <w:sz w:val="19"/>
               </w:rPr>
               <w:t>cast</w:t>
@@ -200,6 +209,7 @@
           <w:p>
             <w:r>
               <w:rPr>
+                <w:color w:val="000000"/>
                 <w:sz w:val="19"/>
               </w:rPr>
               <w:t>2</w:t>
@@ -213,6 +223,7 @@
           <w:p>
             <w:r>
               <w:rPr>
+                <w:color w:val="000000"/>
                 <w:sz w:val="19"/>
               </w:rPr>
               <w:t>casting</w:t>
@@ -226,6 +237,7 @@
           <w:p>
             <w:r>
               <w:rPr>
+                <w:color w:val="000000"/>
                 <w:sz w:val="19"/>
               </w:rPr>
               <w:t>0.7188</w:t>
@@ -241,6 +253,7 @@
           <w:p>
             <w:r>
               <w:rPr>
+                <w:color w:val="000000"/>
                 <w:sz w:val="19"/>
               </w:rPr>
               <w:t>cast</w:t>
@@ -254,6 +267,7 @@
           <w:p>
             <w:r>
               <w:rPr>
+                <w:color w:val="000000"/>
                 <w:sz w:val="19"/>
               </w:rPr>
               <w:t>3</w:t>
@@ -267,6 +281,7 @@
           <w:p>
             <w:r>
               <w:rPr>
+                <w:color w:val="000000"/>
                 <w:sz w:val="19"/>
               </w:rPr>
               <w:t>Cast</w:t>
@@ -280,6 +295,7 @@
           <w:p>
             <w:r>
               <w:rPr>
+                <w:color w:val="000000"/>
                 <w:sz w:val="19"/>
               </w:rPr>
               <w:t>0.6638</w:t>
@@ -295,6 +311,7 @@
           <w:p>
             <w:r>
               <w:rPr>
+                <w:color w:val="000000"/>
                 <w:sz w:val="19"/>
               </w:rPr>
               <w:t>score</w:t>
@@ -308,6 +325,7 @@
           <w:p>
             <w:r>
               <w:rPr>
+                <w:color w:val="000000"/>
                 <w:sz w:val="19"/>
               </w:rPr>
               <w:t>1</w:t>
@@ -321,6 +339,7 @@
           <w:p>
             <w:r>
               <w:rPr>
+                <w:color w:val="000000"/>
                 <w:sz w:val="19"/>
               </w:rPr>
               <w:t>scoring</w:t>
@@ -334,6 +353,7 @@
           <w:p>
             <w:r>
               <w:rPr>
+                <w:color w:val="000000"/>
                 <w:sz w:val="19"/>
               </w:rPr>
               <w:t>0.7197</w:t>
@@ -349,6 +369,7 @@
           <w:p>
             <w:r>
               <w:rPr>
+                <w:color w:val="000000"/>
                 <w:sz w:val="19"/>
               </w:rPr>
               <w:t>score</w:t>
@@ -362,6 +383,7 @@
           <w:p>
             <w:r>
               <w:rPr>
+                <w:color w:val="000000"/>
                 <w:sz w:val="19"/>
               </w:rPr>
               <w:t>2</w:t>
@@ -375,6 +397,7 @@
           <w:p>
             <w:r>
               <w:rPr>
+                <w:color w:val="000000"/>
                 <w:sz w:val="19"/>
               </w:rPr>
               <w:t>scores</w:t>
@@ -388,6 +411,7 @@
           <w:p>
             <w:r>
               <w:rPr>
+                <w:color w:val="000000"/>
                 <w:sz w:val="19"/>
               </w:rPr>
               <w:t>0.6596</w:t>
@@ -403,6 +427,7 @@
           <w:p>
             <w:r>
               <w:rPr>
+                <w:color w:val="000000"/>
                 <w:sz w:val="19"/>
               </w:rPr>
               <w:t>score</w:t>
@@ -416,6 +441,7 @@
           <w:p>
             <w:r>
               <w:rPr>
+                <w:color w:val="000000"/>
                 <w:sz w:val="19"/>
               </w:rPr>
               <w:t>3</w:t>
@@ -429,6 +455,7 @@
           <w:p>
             <w:r>
               <w:rPr>
+                <w:color w:val="000000"/>
                 <w:sz w:val="19"/>
               </w:rPr>
               <w:t>scored</w:t>
@@ -442,6 +469,7 @@
           <w:p>
             <w:r>
               <w:rPr>
+                <w:color w:val="000000"/>
                 <w:sz w:val="19"/>
               </w:rPr>
               <w:t>0.6384</w:t>
@@ -457,6 +485,7 @@
           <w:p>
             <w:r>
               <w:rPr>
+                <w:color w:val="000000"/>
                 <w:sz w:val="19"/>
               </w:rPr>
               <w:t>plot</w:t>
@@ -470,6 +499,7 @@
           <w:p>
             <w:r>
               <w:rPr>
+                <w:color w:val="000000"/>
                 <w:sz w:val="19"/>
               </w:rPr>
               <w:t>1</w:t>
@@ -483,6 +513,7 @@
           <w:p>
             <w:r>
               <w:rPr>
+                <w:color w:val="000000"/>
                 <w:sz w:val="19"/>
               </w:rPr>
               <w:t>plots</w:t>
@@ -496,6 +527,7 @@
           <w:p>
             <w:r>
               <w:rPr>
+                <w:color w:val="000000"/>
                 <w:sz w:val="19"/>
               </w:rPr>
               <w:t>0.7625</w:t>
@@ -511,6 +543,7 @@
           <w:p>
             <w:r>
               <w:rPr>
+                <w:color w:val="000000"/>
                 <w:sz w:val="19"/>
               </w:rPr>
               <w:t>plot</w:t>
@@ -524,6 +557,7 @@
           <w:p>
             <w:r>
               <w:rPr>
+                <w:color w:val="000000"/>
                 <w:sz w:val="19"/>
               </w:rPr>
               <w:t>2</w:t>
@@ -537,6 +571,7 @@
           <w:p>
             <w:r>
               <w:rPr>
+                <w:color w:val="000000"/>
                 <w:sz w:val="19"/>
               </w:rPr>
               <w:t>Plot</w:t>
@@ -550,6 +585,7 @@
           <w:p>
             <w:r>
               <w:rPr>
+                <w:color w:val="000000"/>
                 <w:sz w:val="19"/>
               </w:rPr>
               <w:t>0.6524</w:t>
@@ -565,6 +601,7 @@
           <w:p>
             <w:r>
               <w:rPr>
+                <w:color w:val="000000"/>
                 <w:sz w:val="19"/>
               </w:rPr>
               <w:t>plot</w:t>
@@ -578,6 +615,7 @@
           <w:p>
             <w:r>
               <w:rPr>
+                <w:color w:val="000000"/>
                 <w:sz w:val="19"/>
               </w:rPr>
               <w:t>3</w:t>
@@ -591,6 +629,7 @@
           <w:p>
             <w:r>
               <w:rPr>
+                <w:color w:val="000000"/>
                 <w:sz w:val="19"/>
               </w:rPr>
               <w:t>plotting</w:t>
@@ -604,6 +643,7 @@
           <w:p>
             <w:r>
               <w:rPr>
+                <w:color w:val="000000"/>
                 <w:sz w:val="19"/>
               </w:rPr>
               <w:t>0.6328</w:t>
@@ -619,6 +659,7 @@
           <w:p>
             <w:r>
               <w:rPr>
+                <w:color w:val="000000"/>
                 <w:sz w:val="19"/>
               </w:rPr>
               <w:t>screen</w:t>
@@ -632,6 +673,7 @@
           <w:p>
             <w:r>
               <w:rPr>
+                <w:color w:val="000000"/>
                 <w:sz w:val="19"/>
               </w:rPr>
               <w:t>1</w:t>
@@ -645,6 +687,7 @@
           <w:p>
             <w:r>
               <w:rPr>
+                <w:color w:val="000000"/>
                 <w:sz w:val="19"/>
               </w:rPr>
               <w:t>screens</w:t>
@@ -658,6 +701,7 @@
           <w:p>
             <w:r>
               <w:rPr>
+                <w:color w:val="000000"/>
                 <w:sz w:val="19"/>
               </w:rPr>
               <w:t>0.7729</w:t>
@@ -673,6 +717,7 @@
           <w:p>
             <w:r>
               <w:rPr>
+                <w:color w:val="000000"/>
                 <w:sz w:val="19"/>
               </w:rPr>
               <w:t>screen</w:t>
@@ -686,6 +731,7 @@
           <w:p>
             <w:r>
               <w:rPr>
+                <w:color w:val="000000"/>
                 <w:sz w:val="19"/>
               </w:rPr>
               <w:t>2</w:t>
@@ -699,6 +745,7 @@
           <w:p>
             <w:r>
               <w:rPr>
+                <w:color w:val="000000"/>
                 <w:sz w:val="19"/>
               </w:rPr>
               <w:t>onscreen</w:t>
@@ -712,6 +759,7 @@
           <w:p>
             <w:r>
               <w:rPr>
+                <w:color w:val="000000"/>
                 <w:sz w:val="19"/>
               </w:rPr>
               <w:t>0.6115</w:t>
@@ -727,6 +775,7 @@
           <w:p>
             <w:r>
               <w:rPr>
+                <w:color w:val="000000"/>
                 <w:sz w:val="19"/>
               </w:rPr>
               <w:t>screen</w:t>
@@ -740,6 +789,7 @@
           <w:p>
             <w:r>
               <w:rPr>
+                <w:color w:val="000000"/>
                 <w:sz w:val="19"/>
               </w:rPr>
               <w:t>3</w:t>
@@ -753,6 +803,7 @@
           <w:p>
             <w:r>
               <w:rPr>
+                <w:color w:val="000000"/>
                 <w:sz w:val="19"/>
               </w:rPr>
               <w:t>LCD_screen</w:t>
@@ -766,6 +817,7 @@
           <w:p>
             <w:r>
               <w:rPr>
+                <w:color w:val="000000"/>
                 <w:sz w:val="19"/>
               </w:rPr>
               <w:t>0.5599</w:t>
@@ -781,6 +833,7 @@
           <w:p>
             <w:r>
               <w:rPr>
+                <w:color w:val="000000"/>
                 <w:sz w:val="19"/>
               </w:rPr>
               <w:t>review</w:t>
@@ -794,6 +847,7 @@
           <w:p>
             <w:r>
               <w:rPr>
+                <w:color w:val="000000"/>
                 <w:sz w:val="19"/>
               </w:rPr>
               <w:t>1</w:t>
@@ -807,6 +861,7 @@
           <w:p>
             <w:r>
               <w:rPr>
+                <w:color w:val="000000"/>
                 <w:sz w:val="19"/>
               </w:rPr>
               <w:t>reviewed</w:t>
@@ -820,6 +875,7 @@
           <w:p>
             <w:r>
               <w:rPr>
+                <w:color w:val="000000"/>
                 <w:sz w:val="19"/>
               </w:rPr>
               <w:t>0.663</w:t>
@@ -835,6 +891,7 @@
           <w:p>
             <w:r>
               <w:rPr>
+                <w:color w:val="000000"/>
                 <w:sz w:val="19"/>
               </w:rPr>
               <w:t>review</w:t>
@@ -848,6 +905,7 @@
           <w:p>
             <w:r>
               <w:rPr>
+                <w:color w:val="000000"/>
                 <w:sz w:val="19"/>
               </w:rPr>
               <w:t>2</w:t>
@@ -861,6 +919,7 @@
           <w:p>
             <w:r>
               <w:rPr>
+                <w:color w:val="000000"/>
                 <w:sz w:val="19"/>
               </w:rPr>
               <w:t>reviewing</w:t>
@@ -874,6 +933,7 @@
           <w:p>
             <w:r>
               <w:rPr>
+                <w:color w:val="000000"/>
                 <w:sz w:val="19"/>
               </w:rPr>
               <w:t>0.661</w:t>
@@ -889,6 +949,7 @@
           <w:p>
             <w:r>
               <w:rPr>
+                <w:color w:val="000000"/>
                 <w:sz w:val="19"/>
               </w:rPr>
               <w:t>review</w:t>
@@ -902,6 +963,7 @@
           <w:p>
             <w:r>
               <w:rPr>
+                <w:color w:val="000000"/>
                 <w:sz w:val="19"/>
               </w:rPr>
               <w:t>3</w:t>
@@ -915,6 +977,7 @@
           <w:p>
             <w:r>
               <w:rPr>
+                <w:color w:val="000000"/>
                 <w:sz w:val="19"/>
               </w:rPr>
               <w:t>reviews</w:t>
@@ -928,6 +991,7 @@
           <w:p>
             <w:r>
               <w:rPr>
+                <w:color w:val="000000"/>
                 <w:sz w:val="19"/>
               </w:rPr>
               <w:t>0.638</w:t>
@@ -959,7 +1023,7 @@
           </w:tcPr>
           <w:p>
             <w:pPr>
-              <w:spacing w:before="360" w:after="360"/>
+              <w:spacing w:before="280" w:after="280"/>
               <w:jc w:val="center"/>
             </w:pPr>
             <w:r>
@@ -970,7 +1034,7 @@
               </w:rPr>
               <w:t>[SCREENSHOT PLACEHOLDER]</w:t>
               <w:br/>
-              <w:t>Notebook cell output showing the pretrained-model neighbor table (Part 1, Section 1.2 of the notebook).</w:t>
+              <w:t>Notebook cell showing the pretrained model neighbor table (Part 1, Section 1.2).</w:t>
             </w:r>
           </w:p>
         </w:tc>
@@ -982,7 +1046,7 @@
         <w:pStyle w:val="Heading2"/>
       </w:pPr>
       <w:r>
-        <w:t>1.3 Top-3 nearest neighbors after fine-tuning</w:t>
+        <w:t>1.3 Top 3 nearest neighbors after finetuning</w:t>
       </w:r>
     </w:p>
     <w:tbl>
@@ -1014,6 +1078,7 @@
             <w:r>
               <w:rPr>
                 <w:b/>
+                <w:color w:val="000000"/>
                 <w:sz w:val="19"/>
               </w:rPr>
               <w:t>Word</w:t>
@@ -1029,6 +1094,7 @@
             <w:r>
               <w:rPr>
                 <w:b/>
+                <w:color w:val="000000"/>
                 <w:sz w:val="19"/>
               </w:rPr>
               <w:t>Rank</w:t>
@@ -1044,6 +1110,7 @@
             <w:r>
               <w:rPr>
                 <w:b/>
+                <w:color w:val="000000"/>
                 <w:sz w:val="19"/>
               </w:rPr>
               <w:t>Neighbor</w:t>
@@ -1059,6 +1126,7 @@
             <w:r>
               <w:rPr>
                 <w:b/>
+                <w:color w:val="000000"/>
                 <w:sz w:val="19"/>
               </w:rPr>
               <w:t>Cosine similarity</w:t>
@@ -1074,6 +1142,7 @@
           <w:p>
             <w:r>
               <w:rPr>
+                <w:color w:val="000000"/>
                 <w:sz w:val="19"/>
               </w:rPr>
               <w:t>cast</w:t>
@@ -1087,6 +1156,7 @@
           <w:p>
             <w:r>
               <w:rPr>
+                <w:color w:val="000000"/>
                 <w:sz w:val="19"/>
               </w:rPr>
               <w:t>1</w:t>
@@ -1100,6 +1170,7 @@
           <w:p>
             <w:r>
               <w:rPr>
+                <w:color w:val="000000"/>
                 <w:sz w:val="19"/>
               </w:rPr>
               <w:t>supporting</w:t>
@@ -1113,6 +1184,7 @@
           <w:p>
             <w:r>
               <w:rPr>
+                <w:color w:val="000000"/>
                 <w:sz w:val="19"/>
               </w:rPr>
               <w:t>0.5975</w:t>
@@ -1128,6 +1200,7 @@
           <w:p>
             <w:r>
               <w:rPr>
+                <w:color w:val="000000"/>
                 <w:sz w:val="19"/>
               </w:rPr>
               <w:t>cast</w:t>
@@ -1141,6 +1214,7 @@
           <w:p>
             <w:r>
               <w:rPr>
+                <w:color w:val="000000"/>
                 <w:sz w:val="19"/>
               </w:rPr>
               <w:t>2</w:t>
@@ -1154,6 +1228,7 @@
           <w:p>
             <w:r>
               <w:rPr>
+                <w:color w:val="000000"/>
                 <w:sz w:val="19"/>
               </w:rPr>
               <w:t>ensemble</w:t>
@@ -1167,6 +1242,7 @@
           <w:p>
             <w:r>
               <w:rPr>
+                <w:color w:val="000000"/>
                 <w:sz w:val="19"/>
               </w:rPr>
               <w:t>0.5629</w:t>
@@ -1182,6 +1258,7 @@
           <w:p>
             <w:r>
               <w:rPr>
+                <w:color w:val="000000"/>
                 <w:sz w:val="19"/>
               </w:rPr>
               <w:t>cast</w:t>
@@ -1195,6 +1272,7 @@
           <w:p>
             <w:r>
               <w:rPr>
+                <w:color w:val="000000"/>
                 <w:sz w:val="19"/>
               </w:rPr>
               <w:t>3</w:t>
@@ -1208,6 +1286,7 @@
           <w:p>
             <w:r>
               <w:rPr>
+                <w:color w:val="000000"/>
                 <w:sz w:val="19"/>
               </w:rPr>
               <w:t>casts</w:t>
@@ -1221,6 +1300,7 @@
           <w:p>
             <w:r>
               <w:rPr>
+                <w:color w:val="000000"/>
                 <w:sz w:val="19"/>
               </w:rPr>
               <w:t>0.5266</w:t>
@@ -1236,6 +1316,7 @@
           <w:p>
             <w:r>
               <w:rPr>
+                <w:color w:val="000000"/>
                 <w:sz w:val="19"/>
               </w:rPr>
               <w:t>score</w:t>
@@ -1249,6 +1330,7 @@
           <w:p>
             <w:r>
               <w:rPr>
+                <w:color w:val="000000"/>
                 <w:sz w:val="19"/>
               </w:rPr>
               <w:t>1</w:t>
@@ -1262,6 +1344,7 @@
           <w:p>
             <w:r>
               <w:rPr>
+                <w:color w:val="000000"/>
                 <w:sz w:val="19"/>
               </w:rPr>
               <w:t>ennio</w:t>
@@ -1275,6 +1358,7 @@
           <w:p>
             <w:r>
               <w:rPr>
+                <w:color w:val="000000"/>
                 <w:sz w:val="19"/>
               </w:rPr>
               <w:t>0.5714</w:t>
@@ -1290,6 +1374,7 @@
           <w:p>
             <w:r>
               <w:rPr>
+                <w:color w:val="000000"/>
                 <w:sz w:val="19"/>
               </w:rPr>
               <w:t>score</w:t>
@@ -1303,6 +1388,7 @@
           <w:p>
             <w:r>
               <w:rPr>
+                <w:color w:val="000000"/>
                 <w:sz w:val="19"/>
               </w:rPr>
               <w:t>2</w:t>
@@ -1316,6 +1402,7 @@
           <w:p>
             <w:r>
               <w:rPr>
+                <w:color w:val="000000"/>
                 <w:sz w:val="19"/>
               </w:rPr>
               <w:t>morricone</w:t>
@@ -1329,6 +1416,7 @@
           <w:p>
             <w:r>
               <w:rPr>
+                <w:color w:val="000000"/>
                 <w:sz w:val="19"/>
               </w:rPr>
               <w:t>0.5708</w:t>
@@ -1344,6 +1432,7 @@
           <w:p>
             <w:r>
               <w:rPr>
+                <w:color w:val="000000"/>
                 <w:sz w:val="19"/>
               </w:rPr>
               <w:t>score</w:t>
@@ -1357,6 +1446,7 @@
           <w:p>
             <w:r>
               <w:rPr>
+                <w:color w:val="000000"/>
                 <w:sz w:val="19"/>
               </w:rPr>
               <w:t>3</w:t>
@@ -1370,6 +1460,7 @@
           <w:p>
             <w:r>
               <w:rPr>
+                <w:color w:val="000000"/>
                 <w:sz w:val="19"/>
               </w:rPr>
               <w:t>scoring</w:t>
@@ -1383,6 +1474,7 @@
           <w:p>
             <w:r>
               <w:rPr>
+                <w:color w:val="000000"/>
                 <w:sz w:val="19"/>
               </w:rPr>
               <w:t>0.5438</w:t>
@@ -1398,6 +1490,7 @@
           <w:p>
             <w:r>
               <w:rPr>
+                <w:color w:val="000000"/>
                 <w:sz w:val="19"/>
               </w:rPr>
               <w:t>plot</w:t>
@@ -1411,6 +1504,7 @@
           <w:p>
             <w:r>
               <w:rPr>
+                <w:color w:val="000000"/>
                 <w:sz w:val="19"/>
               </w:rPr>
               <w:t>1</w:t>
@@ -1424,6 +1518,7 @@
           <w:p>
             <w:r>
               <w:rPr>
+                <w:color w:val="000000"/>
                 <w:sz w:val="19"/>
               </w:rPr>
               <w:t>story</w:t>
@@ -1437,6 +1532,7 @@
           <w:p>
             <w:r>
               <w:rPr>
+                <w:color w:val="000000"/>
                 <w:sz w:val="19"/>
               </w:rPr>
               <w:t>0.6103</w:t>
@@ -1452,6 +1548,7 @@
           <w:p>
             <w:r>
               <w:rPr>
+                <w:color w:val="000000"/>
                 <w:sz w:val="19"/>
               </w:rPr>
               <w:t>plot</w:t>
@@ -1465,6 +1562,7 @@
           <w:p>
             <w:r>
               <w:rPr>
+                <w:color w:val="000000"/>
                 <w:sz w:val="19"/>
               </w:rPr>
               <w:t>2</w:t>
@@ -1478,6 +1576,7 @@
           <w:p>
             <w:r>
               <w:rPr>
+                <w:color w:val="000000"/>
                 <w:sz w:val="19"/>
               </w:rPr>
               <w:t>storyline</w:t>
@@ -1491,6 +1590,7 @@
           <w:p>
             <w:r>
               <w:rPr>
+                <w:color w:val="000000"/>
                 <w:sz w:val="19"/>
               </w:rPr>
               <w:t>0.5662</w:t>
@@ -1506,6 +1606,7 @@
           <w:p>
             <w:r>
               <w:rPr>
+                <w:color w:val="000000"/>
                 <w:sz w:val="19"/>
               </w:rPr>
               <w:t>plot</w:t>
@@ -1519,6 +1620,7 @@
           <w:p>
             <w:r>
               <w:rPr>
+                <w:color w:val="000000"/>
                 <w:sz w:val="19"/>
               </w:rPr>
               <w:t>3</w:t>
@@ -1532,6 +1634,7 @@
           <w:p>
             <w:r>
               <w:rPr>
+                <w:color w:val="000000"/>
                 <w:sz w:val="19"/>
               </w:rPr>
               <w:t>plotline</w:t>
@@ -1545,6 +1648,7 @@
           <w:p>
             <w:r>
               <w:rPr>
+                <w:color w:val="000000"/>
                 <w:sz w:val="19"/>
               </w:rPr>
               <w:t>0.5534</w:t>
@@ -1560,6 +1664,7 @@
           <w:p>
             <w:r>
               <w:rPr>
+                <w:color w:val="000000"/>
                 <w:sz w:val="19"/>
               </w:rPr>
               <w:t>screen</w:t>
@@ -1573,6 +1678,7 @@
           <w:p>
             <w:r>
               <w:rPr>
+                <w:color w:val="000000"/>
                 <w:sz w:val="19"/>
               </w:rPr>
               <w:t>1</w:t>
@@ -1586,6 +1692,7 @@
           <w:p>
             <w:r>
               <w:rPr>
+                <w:color w:val="000000"/>
                 <w:sz w:val="19"/>
               </w:rPr>
               <w:t>screens</w:t>
@@ -1599,6 +1706,7 @@
           <w:p>
             <w:r>
               <w:rPr>
+                <w:color w:val="000000"/>
                 <w:sz w:val="19"/>
               </w:rPr>
               <w:t>0.5327</w:t>
@@ -1614,6 +1722,7 @@
           <w:p>
             <w:r>
               <w:rPr>
+                <w:color w:val="000000"/>
                 <w:sz w:val="19"/>
               </w:rPr>
               <w:t>screen</w:t>
@@ -1627,6 +1736,7 @@
           <w:p>
             <w:r>
               <w:rPr>
+                <w:color w:val="000000"/>
                 <w:sz w:val="19"/>
               </w:rPr>
               <w:t>2</w:t>
@@ -1640,6 +1750,7 @@
           <w:p>
             <w:r>
               <w:rPr>
+                <w:color w:val="000000"/>
                 <w:sz w:val="19"/>
               </w:rPr>
               <w:t>onscreen</w:t>
@@ -1653,6 +1764,7 @@
           <w:p>
             <w:r>
               <w:rPr>
+                <w:color w:val="000000"/>
                 <w:sz w:val="19"/>
               </w:rPr>
               <w:t>0.5216</w:t>
@@ -1668,6 +1780,7 @@
           <w:p>
             <w:r>
               <w:rPr>
+                <w:color w:val="000000"/>
                 <w:sz w:val="19"/>
               </w:rPr>
               <w:t>screen</w:t>
@@ -1681,6 +1794,7 @@
           <w:p>
             <w:r>
               <w:rPr>
+                <w:color w:val="000000"/>
                 <w:sz w:val="19"/>
               </w:rPr>
               <w:t>3</w:t>
@@ -1694,6 +1808,7 @@
           <w:p>
             <w:r>
               <w:rPr>
+                <w:color w:val="000000"/>
                 <w:sz w:val="19"/>
               </w:rPr>
               <w:t>kapadia</w:t>
@@ -1707,6 +1822,7 @@
           <w:p>
             <w:r>
               <w:rPr>
+                <w:color w:val="000000"/>
                 <w:sz w:val="19"/>
               </w:rPr>
               <w:t>0.3945</w:t>
@@ -1722,6 +1838,7 @@
           <w:p>
             <w:r>
               <w:rPr>
+                <w:color w:val="000000"/>
                 <w:sz w:val="19"/>
               </w:rPr>
               <w:t>review</w:t>
@@ -1735,6 +1852,7 @@
           <w:p>
             <w:r>
               <w:rPr>
+                <w:color w:val="000000"/>
                 <w:sz w:val="19"/>
               </w:rPr>
               <w:t>1</w:t>
@@ -1748,6 +1866,7 @@
           <w:p>
             <w:r>
               <w:rPr>
+                <w:color w:val="000000"/>
                 <w:sz w:val="19"/>
               </w:rPr>
               <w:t>reviews</w:t>
@@ -1761,6 +1880,7 @@
           <w:p>
             <w:r>
               <w:rPr>
+                <w:color w:val="000000"/>
                 <w:sz w:val="19"/>
               </w:rPr>
               <w:t>0.6052</w:t>
@@ -1776,6 +1896,7 @@
           <w:p>
             <w:r>
               <w:rPr>
+                <w:color w:val="000000"/>
                 <w:sz w:val="19"/>
               </w:rPr>
               <w:t>review</w:t>
@@ -1789,6 +1910,7 @@
           <w:p>
             <w:r>
               <w:rPr>
+                <w:color w:val="000000"/>
                 <w:sz w:val="19"/>
               </w:rPr>
               <w:t>2</w:t>
@@ -1802,6 +1924,7 @@
           <w:p>
             <w:r>
               <w:rPr>
+                <w:color w:val="000000"/>
                 <w:sz w:val="19"/>
               </w:rPr>
               <w:t>comment</w:t>
@@ -1815,6 +1938,7 @@
           <w:p>
             <w:r>
               <w:rPr>
+                <w:color w:val="000000"/>
                 <w:sz w:val="19"/>
               </w:rPr>
               <w:t>0.5809</w:t>
@@ -1830,6 +1954,7 @@
           <w:p>
             <w:r>
               <w:rPr>
+                <w:color w:val="000000"/>
                 <w:sz w:val="19"/>
               </w:rPr>
               <w:t>review</w:t>
@@ -1843,6 +1968,7 @@
           <w:p>
             <w:r>
               <w:rPr>
+                <w:color w:val="000000"/>
                 <w:sz w:val="19"/>
               </w:rPr>
               <w:t>3</w:t>
@@ -1856,6 +1982,7 @@
           <w:p>
             <w:r>
               <w:rPr>
+                <w:color w:val="000000"/>
                 <w:sz w:val="19"/>
               </w:rPr>
               <w:t>comments</w:t>
@@ -1869,6 +1996,7 @@
           <w:p>
             <w:r>
               <w:rPr>
+                <w:color w:val="000000"/>
                 <w:sz w:val="19"/>
               </w:rPr>
               <w:t>0.5578</w:t>
@@ -1880,7 +2008,7 @@
     <w:p/>
     <w:p>
       <w:r>
-        <w:t>Every target word's neighbors shift toward its domain-specific, film-critique sense after fine-tuning: cast toward supporting/ensemble (an ensemble cast of actors), score toward ennio/morricone (the film composer Ennio Morricone), plot toward story/storyline (narrative plot, not a literal plot of land), and review toward reviews/comment/comments (review-discussion context). screen was already film-adjacent pre-fine-tuning and shifts the least in sense.</w:t>
+        <w:t>Neighbors shift toward the film sense of each word after finetuning: cast toward supporting and ensemble, score toward ennio and morricone (the composer Ennio Morricone), plot toward story and storyline, and review toward reviews and comment. screen changes the least since it was already film related before finetuning.</w:t>
       </w:r>
     </w:p>
     <w:tbl>
@@ -1905,7 +2033,7 @@
           </w:tcPr>
           <w:p>
             <w:pPr>
-              <w:spacing w:before="360" w:after="360"/>
+              <w:spacing w:before="280" w:after="280"/>
               <w:jc w:val="center"/>
             </w:pPr>
             <w:r>
@@ -1916,7 +2044,7 @@
               </w:rPr>
               <w:t>[SCREENSHOT PLACEHOLDER]</w:t>
               <w:br/>
-              <w:t>Notebook cell output showing the fine-tuned-model neighbor table, and the fine-tuning training log (IMDB load, tokenization, vector initialization count, training time) (Part 1, Sections 1.3-1.4 of the notebook).</w:t>
+              <w:t>Notebook cell showing the finetuned model neighbor table and the finetuning training log (Part 1, Sections 1.3 and 1.4).</w:t>
             </w:r>
           </w:p>
         </w:tc>
@@ -1928,12 +2056,12 @@
         <w:pStyle w:val="Heading2"/>
       </w:pPr>
       <w:r>
-        <w:t>1.4 t-SNE visualization of the embedding shift</w:t>
+        <w:t>1.4 2D visualization of the embedding shift</w:t>
       </w:r>
     </w:p>
     <w:p>
       <w:r>
-        <w:t>Figure 1 projects all 5 words' own vectors (before and after fine-tuning) into 2D with t-SNE, connecting each word's before/after position with an arrow. Figure 2 zooms in on plot specifically, together with its top-3 neighbors in both spaces.</w:t>
+        <w:t>Figure 1 shows all 5 words before and after finetuning in 2D using t SNE. Figure 2 zooms in on plot and its top 3 neighbors in both spaces. plot moves away from plots and plotting and toward story and storyline.</w:t>
       </w:r>
     </w:p>
     <w:tbl>
@@ -1958,7 +2086,7 @@
           </w:tcPr>
           <w:p>
             <w:pPr>
-              <w:spacing w:before="360" w:after="360"/>
+              <w:spacing w:before="280" w:after="280"/>
               <w:jc w:val="center"/>
             </w:pPr>
             <w:r>
@@ -1969,7 +2097,7 @@
               </w:rPr>
               <w:t>[SCREENSHOT PLACEHOLDER]</w:t>
               <w:br/>
-              <w:t>Figure 1 - t-SNE plot of all 5 words' before/after positions (Part 1, Section 1.7 of the notebook).</w:t>
+              <w:t>Figure 1, t SNE plot of all 5 words before and after finetuning (Part 1, Section 1.7).</w:t>
             </w:r>
           </w:p>
         </w:tc>
@@ -1998,7 +2126,7 @@
           </w:tcPr>
           <w:p>
             <w:pPr>
-              <w:spacing w:before="360" w:after="360"/>
+              <w:spacing w:before="280" w:after="280"/>
               <w:jc w:val="center"/>
             </w:pPr>
             <w:r>
@@ -2009,24 +2137,19 @@
               </w:rPr>
               <w:t>[SCREENSHOT PLACEHOLDER]</w:t>
               <w:br/>
-              <w:t>Figure 2 - t-SNE detail plot of 'plot' and its neighbors, before vs after fine-tuning (Part 1, Section 1.7 of the notebook).</w:t>
+              <w:t>Figure 2, t SNE detail plot of plot and its neighbors, before and after finetuning (Part 1, Section 1.7).</w:t>
             </w:r>
           </w:p>
         </w:tc>
       </w:tr>
     </w:tbl>
     <w:p/>
-    <w:p>
-      <w:r>
-        <w:t>'plot' visibly moves away from its morphological/literal neighbors (plots, plotting, Plot) and toward its narrative-sense neighbors (story, storyline, plotline) -- a clean, visual confirmation of the domain-adaptation effect.</w:t>
-      </w:r>
-    </w:p>
     <w:p>
       <w:pPr>
         <w:pStyle w:val="Heading2"/>
       </w:pPr>
       <w:r>
-        <w:t>1.5 Per-word vector drift: original vs. fine-tuned</w:t>
+        <w:t>1.5 Cosine similarity of each word, original vs finetuned</w:t>
       </w:r>
     </w:p>
     <w:tbl>
@@ -2056,6 +2179,7 @@
             <w:r>
               <w:rPr>
                 <w:b/>
+                <w:color w:val="000000"/>
                 <w:sz w:val="19"/>
               </w:rPr>
               <w:t>Word</w:t>
@@ -2071,9 +2195,10 @@
             <w:r>
               <w:rPr>
                 <w:b/>
-                <w:sz w:val="19"/>
-              </w:rPr>
-              <w:t>Cosine similarity (before vs. after)</w:t>
+                <w:color w:val="000000"/>
+                <w:sz w:val="19"/>
+              </w:rPr>
+              <w:t>Cosine similarity (original vs finetuned)</w:t>
             </w:r>
           </w:p>
         </w:tc>
@@ -2086,6 +2211,7 @@
           <w:p>
             <w:r>
               <w:rPr>
+                <w:color w:val="000000"/>
                 <w:sz w:val="19"/>
               </w:rPr>
               <w:t>review</w:t>
@@ -2099,6 +2225,7 @@
           <w:p>
             <w:r>
               <w:rPr>
+                <w:color w:val="000000"/>
                 <w:sz w:val="19"/>
               </w:rPr>
               <w:t>0.5757</w:t>
@@ -2114,6 +2241,7 @@
           <w:p>
             <w:r>
               <w:rPr>
+                <w:color w:val="000000"/>
                 <w:sz w:val="19"/>
               </w:rPr>
               <w:t>score</w:t>
@@ -2127,6 +2255,7 @@
           <w:p>
             <w:r>
               <w:rPr>
+                <w:color w:val="000000"/>
                 <w:sz w:val="19"/>
               </w:rPr>
               <w:t>0.6441</w:t>
@@ -2142,6 +2271,7 @@
           <w:p>
             <w:r>
               <w:rPr>
+                <w:color w:val="000000"/>
                 <w:sz w:val="19"/>
               </w:rPr>
               <w:t>screen</w:t>
@@ -2155,6 +2285,7 @@
           <w:p>
             <w:r>
               <w:rPr>
+                <w:color w:val="000000"/>
                 <w:sz w:val="19"/>
               </w:rPr>
               <w:t>0.6652</w:t>
@@ -2170,6 +2301,7 @@
           <w:p>
             <w:r>
               <w:rPr>
+                <w:color w:val="000000"/>
                 <w:sz w:val="19"/>
               </w:rPr>
               <w:t>plot</w:t>
@@ -2183,6 +2315,7 @@
           <w:p>
             <w:r>
               <w:rPr>
+                <w:color w:val="000000"/>
                 <w:sz w:val="19"/>
               </w:rPr>
               <w:t>0.6738</w:t>
@@ -2198,6 +2331,7 @@
           <w:p>
             <w:r>
               <w:rPr>
+                <w:color w:val="000000"/>
                 <w:sz w:val="19"/>
               </w:rPr>
               <w:t>cast</w:t>
@@ -2211,6 +2345,7 @@
           <w:p>
             <w:r>
               <w:rPr>
+                <w:color w:val="000000"/>
                 <w:sz w:val="19"/>
               </w:rPr>
               <w:t>0.6969</w:t>
@@ -2222,12 +2357,12 @@
     <w:p/>
     <w:p>
       <w:r>
-        <w:t>Most shifted word: review (cosine similarity = 0.5757). In general news text "review" spans many senses (performance review, code review, review of evidence); IMDB's narrow, repetitive "movie review / reader comment" usage pulls it hardest away from its pretrained position.</w:t>
+        <w:t>Most shifted word: review (cosine similarity 0.5757). review has many general senses (performance review, code review) so the narrow IMDB usage pulls it furthest from its pretrained position.</w:t>
       </w:r>
     </w:p>
     <w:p>
       <w:r>
-        <w:t>Least shifted word: cast (cosine similarity = 0.6969). "cast" already has a strong film/theater sense in general English (a movie's cast), so IMDB usage reinforces rather than redefines its pretrained meaning.</w:t>
+        <w:t>Least shifted word: cast (cosine similarity 0.6969). cast already carries a strong film sense in general English, so IMDB usage reinforces rather than changes its meaning.</w:t>
       </w:r>
     </w:p>
     <w:tbl>
@@ -2252,7 +2387,7 @@
           </w:tcPr>
           <w:p>
             <w:pPr>
-              <w:spacing w:before="360" w:after="360"/>
+              <w:spacing w:before="280" w:after="280"/>
               <w:jc w:val="center"/>
             </w:pPr>
             <w:r>
@@ -2263,7 +2398,7 @@
               </w:rPr>
               <w:t>[SCREENSHOT PLACEHOLDER]</w:t>
               <w:br/>
-              <w:t>Notebook cell output showing the vector-drift table and the most-shifted / least-shifted print statement (Part 1, Section 1.8 of the notebook).</w:t>
+              <w:t>Notebook cell showing the cosine similarity table and the most shifted / least shifted print statement (Part 1, Section 1.8).</w:t>
             </w:r>
           </w:p>
         </w:tc>
@@ -2275,7 +2410,7 @@
         <w:pStyle w:val="Heading1"/>
       </w:pPr>
       <w:r>
-        <w:t>2. Retrieval-Augmented Generation (RAG) Pipeline</w:t>
+        <w:t>2. Retrieval Augmented Generation (RAG) Pipeline</w:t>
       </w:r>
     </w:p>
     <w:p>
@@ -2288,7 +2423,7 @@
     </w:p>
     <w:p>
       <w:r>
-        <w:t>Corpus: Wikipedia pages for 10 movies (Inception, The Matrix, Titanic (1997), The Godfather, Pulp Fiction, Forrest Gump, The Dark Knight, Jurassic Park, The Shawshank Redemption, Interstellar), fetched with the wikipedia package and loaded with LangChain's DirectoryLoader + TextLoader. Splitter: LangChain RecursiveCharacterTextSplitter, chunk_size=500, chunk_overlap=50, producing 1,970 chunks from the 10 documents. Embeddings: sentence-transformers/all-MiniLM-L6-v2 via HuggingFaceEmbeddings. Vector store: FAISS, top-k=3 retriever. LLM: Qwen/Qwen2.5-0.5B-Instruct (local, greedy decoding for reproducibility), called through transformers.pipeline. The pipeline is built from explicit components -- a PromptTemplate, the FAISS retriever, and a direct LLM call -- rather than a single pre-built chain such as RetrievalQA.</w:t>
+        <w:t>Corpus: Wikipedia pages for 10 movies, loaded with LangChain DirectoryLoader and TextLoader. Splitter: RecursiveCharacterTextSplitter, chunk size 500, chunk overlap 50, giving 1,970 chunks. Embeddings: sentence transformers/all MiniLM L6 v2. Vector store: FAISS, retriever returns the top 3 chunks. LLM: Qwen2.5 0.5B Instruct, run locally with greedy decoding for reproducible answers. The pipeline uses explicit steps, a prompt template, a retriever, and a direct LLM call, instead of one prebuilt chain.</w:t>
       </w:r>
     </w:p>
     <w:tbl>
@@ -2313,7 +2448,7 @@
           </w:tcPr>
           <w:p>
             <w:pPr>
-              <w:spacing w:before="360" w:after="360"/>
+              <w:spacing w:before="280" w:after="280"/>
               <w:jc w:val="center"/>
             </w:pPr>
             <w:r>
@@ -2324,7 +2459,7 @@
               </w:rPr>
               <w:t>[SCREENSHOT PLACEHOLDER]</w:t>
               <w:br/>
-              <w:t>Notebook cell output showing the 10 loaded documents (with char counts) and the chunk count after splitting (Part 2, Sections 2.1-2.3 of the notebook).</w:t>
+              <w:t>Notebook cell showing the 10 loaded documents and the chunk count after splitting (Part 2, Sections 2.1 to 2.3).</w:t>
             </w:r>
           </w:p>
         </w:tc>
@@ -2336,7 +2471,7 @@
         <w:pStyle w:val="Heading2"/>
       </w:pPr>
       <w:r>
-        <w:t>2.2 Five questions, retrieved chunks, and generated answers (original config: 500/50)</w:t>
+        <w:t>2.2 Five questions, retrieved chunks, and generated answers (chunk size 500, overlap 50)</w:t>
       </w:r>
     </w:p>
     <w:tbl>
@@ -2369,6 +2504,7 @@
             <w:r>
               <w:rPr>
                 <w:b/>
+                <w:color w:val="000000"/>
                 <w:sz w:val="19"/>
               </w:rPr>
               <w:t>#</w:t>
@@ -2384,6 +2520,7 @@
             <w:r>
               <w:rPr>
                 <w:b/>
+                <w:color w:val="000000"/>
                 <w:sz w:val="19"/>
               </w:rPr>
               <w:t>Question</w:t>
@@ -2399,9 +2536,10 @@
             <w:r>
               <w:rPr>
                 <w:b/>
-                <w:sz w:val="19"/>
-              </w:rPr>
-              <w:t>Top retrieved chunk (source)</w:t>
+                <w:color w:val="000000"/>
+                <w:sz w:val="19"/>
+              </w:rPr>
+              <w:t>Top retrieved chunk source (of 3)</w:t>
             </w:r>
           </w:p>
         </w:tc>
@@ -2414,6 +2552,7 @@
             <w:r>
               <w:rPr>
                 <w:b/>
+                <w:color w:val="000000"/>
                 <w:sz w:val="19"/>
               </w:rPr>
               <w:t>Generated answer</w:t>
@@ -2429,9 +2568,10 @@
             <w:r>
               <w:rPr>
                 <w:b/>
-                <w:sz w:val="19"/>
-              </w:rPr>
-              <w:t>Correct?</w:t>
+                <w:color w:val="000000"/>
+                <w:sz w:val="19"/>
+              </w:rPr>
+              <w:t>Correct</w:t>
             </w:r>
           </w:p>
         </w:tc>
@@ -2444,6 +2584,7 @@
           <w:p>
             <w:r>
               <w:rPr>
+                <w:color w:val="000000"/>
                 <w:sz w:val="19"/>
               </w:rPr>
               <w:t>1</w:t>
@@ -2457,6 +2598,7 @@
           <w:p>
             <w:r>
               <w:rPr>
+                <w:color w:val="000000"/>
                 <w:sz w:val="19"/>
               </w:rPr>
               <w:t>Who directed Inception and who composed its music?</w:t>
@@ -2470,6 +2612,7 @@
           <w:p>
             <w:r>
               <w:rPr>
+                <w:color w:val="000000"/>
                 <w:sz w:val="19"/>
               </w:rPr>
               <w:t>Inception.txt</w:t>
@@ -2483,6 +2626,7 @@
           <w:p>
             <w:r>
               <w:rPr>
+                <w:color w:val="000000"/>
                 <w:sz w:val="19"/>
               </w:rPr>
               <w:t>Christopher Nolan directed Inception, while Hans Zimmer composed its music.</w:t>
@@ -2496,6 +2640,7 @@
           <w:p>
             <w:r>
               <w:rPr>
+                <w:color w:val="000000"/>
                 <w:sz w:val="19"/>
               </w:rPr>
               <w:t>Yes</w:t>
@@ -2511,6 +2656,7 @@
           <w:p>
             <w:r>
               <w:rPr>
+                <w:color w:val="000000"/>
                 <w:sz w:val="19"/>
               </w:rPr>
               <w:t>2</w:t>
@@ -2524,6 +2670,7 @@
           <w:p>
             <w:r>
               <w:rPr>
+                <w:color w:val="000000"/>
                 <w:sz w:val="19"/>
               </w:rPr>
               <w:t>What is the profession of Andy Dufresne before he was imprisoned in The Shawshank Redemption?</w:t>
@@ -2537,6 +2684,7 @@
           <w:p>
             <w:r>
               <w:rPr>
+                <w:color w:val="000000"/>
                 <w:sz w:val="19"/>
               </w:rPr>
               <w:t>The_Shawshank_Redemption.txt</w:t>
@@ -2550,6 +2698,7 @@
           <w:p>
             <w:r>
               <w:rPr>
+                <w:color w:val="000000"/>
                 <w:sz w:val="19"/>
               </w:rPr>
               <w:t>Before being imprisoned in The Shawshank Redemption, Andy Dufresne worked as a banker.</w:t>
@@ -2563,6 +2712,7 @@
           <w:p>
             <w:r>
               <w:rPr>
+                <w:color w:val="000000"/>
                 <w:sz w:val="19"/>
               </w:rPr>
               <w:t>Yes</w:t>
@@ -2578,6 +2728,7 @@
           <w:p>
             <w:r>
               <w:rPr>
+                <w:color w:val="000000"/>
                 <w:sz w:val="19"/>
               </w:rPr>
               <w:t>3</w:t>
@@ -2591,6 +2742,7 @@
           <w:p>
             <w:r>
               <w:rPr>
+                <w:color w:val="000000"/>
                 <w:sz w:val="19"/>
               </w:rPr>
               <w:t>What ship does the film Titanic depict sinking, and in what year did it sink?</w:t>
@@ -2604,6 +2756,7 @@
           <w:p>
             <w:r>
               <w:rPr>
+                <w:color w:val="000000"/>
                 <w:sz w:val="19"/>
               </w:rPr>
               <w:t>Titanic_1997.txt</w:t>
@@ -2617,6 +2770,7 @@
           <w:p>
             <w:r>
               <w:rPr>
+                <w:color w:val="000000"/>
                 <w:sz w:val="19"/>
               </w:rPr>
               <w:t>The film Titanic depicts the sinking of the RMS Titanic in 1912.</w:t>
@@ -2630,6 +2784,7 @@
           <w:p>
             <w:r>
               <w:rPr>
+                <w:color w:val="000000"/>
                 <w:sz w:val="19"/>
               </w:rPr>
               <w:t>Yes</w:t>
@@ -2645,6 +2800,7 @@
           <w:p>
             <w:r>
               <w:rPr>
+                <w:color w:val="000000"/>
                 <w:sz w:val="19"/>
               </w:rPr>
               <w:t>4</w:t>
@@ -2658,6 +2814,7 @@
           <w:p>
             <w:r>
               <w:rPr>
+                <w:color w:val="000000"/>
                 <w:sz w:val="19"/>
               </w:rPr>
               <w:t>In The Matrix, what is the name of the character played by Keanu Reeves?</w:t>
@@ -2671,6 +2828,7 @@
           <w:p>
             <w:r>
               <w:rPr>
+                <w:color w:val="000000"/>
                 <w:sz w:val="19"/>
               </w:rPr>
               <w:t>The Matrix.txt</w:t>
@@ -2684,6 +2842,7 @@
           <w:p>
             <w:r>
               <w:rPr>
+                <w:color w:val="000000"/>
                 <w:sz w:val="19"/>
               </w:rPr>
               <w:t>Keanu Reeves as Neo</w:t>
@@ -2697,6 +2856,7 @@
           <w:p>
             <w:r>
               <w:rPr>
+                <w:color w:val="000000"/>
                 <w:sz w:val="19"/>
               </w:rPr>
               <w:t>Yes</w:t>
@@ -2712,6 +2872,7 @@
           <w:p>
             <w:r>
               <w:rPr>
+                <w:color w:val="000000"/>
                 <w:sz w:val="19"/>
               </w:rPr>
               <w:t>5</w:t>
@@ -2725,6 +2886,7 @@
           <w:p>
             <w:r>
               <w:rPr>
+                <w:color w:val="000000"/>
                 <w:sz w:val="19"/>
               </w:rPr>
               <w:t>What dinosaur species famously breaks out of its paddock in Jurassic Park?</w:t>
@@ -2738,6 +2900,7 @@
           <w:p>
             <w:r>
               <w:rPr>
+                <w:color w:val="000000"/>
                 <w:sz w:val="19"/>
               </w:rPr>
               <w:t>Jurassic_Park.txt</w:t>
@@ -2751,9 +2914,10 @@
           <w:p>
             <w:r>
               <w:rPr>
-                <w:sz w:val="19"/>
-              </w:rPr>
-              <w:t>The famous dinosaur species that famously breaks out of its paddock in Jurassic Park is the Velociraptor.</w:t>
+                <w:color w:val="000000"/>
+                <w:sz w:val="19"/>
+              </w:rPr>
+              <w:t>The dinosaur species that breaks out of its paddock in Jurassic Park is the Velociraptor.</w:t>
             </w:r>
           </w:p>
         </w:tc>
@@ -2764,9 +2928,10 @@
           <w:p>
             <w:r>
               <w:rPr>
-                <w:sz w:val="19"/>
-              </w:rPr>
-              <w:t>No (correct answer: Tyrannosaurus rex)</w:t>
+                <w:color w:val="000000"/>
+                <w:sz w:val="19"/>
+              </w:rPr>
+              <w:t>No, correct answer is Tyrannosaurus rex</w:t>
             </w:r>
           </w:p>
         </w:tc>
@@ -2795,7 +2960,7 @@
           </w:tcPr>
           <w:p>
             <w:pPr>
-              <w:spacing w:before="360" w:after="360"/>
+              <w:spacing w:before="280" w:after="280"/>
               <w:jc w:val="center"/>
             </w:pPr>
             <w:r>
@@ -2806,7 +2971,7 @@
               </w:rPr>
               <w:t>[SCREENSHOT PLACEHOLDER]</w:t>
               <w:br/>
-              <w:t>Notebook cell output showing all 5 questions with their retrieved chunks (top-3, with source filenames) and generated answers, original 500/50 configuration (Part 2, Section 2.5 of the notebook).</w:t>
+              <w:t>Notebook cell showing all 5 questions with their top 3 retrieved chunks and generated answers, chunk size 500 overlap 50 (Part 2, Section 2.5).</w:t>
             </w:r>
           </w:p>
         </w:tc>
@@ -2818,12 +2983,12 @@
         <w:pStyle w:val="Heading2"/>
       </w:pPr>
       <w:r>
-        <w:t>2.3 Reconfigured chunk size/overlap (1000/100) for 2 of the 5 questions</w:t>
+        <w:t>2.3 Changed chunk size and overlap for 2 of the 5 questions</w:t>
       </w:r>
     </w:p>
     <w:p>
       <w:r>
-        <w:t>The vector store was rebuilt with chunk_size=1000, chunk_overlap=100 (1,112 chunks instead of 1,970), and the Jurassic Park and Titanic questions were re-run.</w:t>
+        <w:t>The vector store was rebuilt with chunk size 1000, chunk overlap 100 (1,112 chunks instead of 1,970), and the Jurassic Park and Titanic questions were run again.</w:t>
       </w:r>
     </w:p>
     <w:tbl>
@@ -2854,6 +3019,7 @@
             <w:r>
               <w:rPr>
                 <w:b/>
+                <w:color w:val="000000"/>
                 <w:sz w:val="19"/>
               </w:rPr>
               <w:t>Question</w:t>
@@ -2869,9 +3035,10 @@
             <w:r>
               <w:rPr>
                 <w:b/>
-                <w:sz w:val="19"/>
-              </w:rPr>
-              <w:t>Original (500/50)</w:t>
+                <w:color w:val="000000"/>
+                <w:sz w:val="19"/>
+              </w:rPr>
+              <w:t>Original, size 500 overlap 50</w:t>
             </w:r>
           </w:p>
         </w:tc>
@@ -2884,9 +3051,10 @@
             <w:r>
               <w:rPr>
                 <w:b/>
-                <w:sz w:val="19"/>
-              </w:rPr>
-              <w:t>Reconfigured (1000/100)</w:t>
+                <w:color w:val="000000"/>
+                <w:sz w:val="19"/>
+              </w:rPr>
+              <w:t>Changed, size 1000 overlap 100</w:t>
             </w:r>
           </w:p>
         </w:tc>
@@ -2899,6 +3067,7 @@
           <w:p>
             <w:r>
               <w:rPr>
+                <w:color w:val="000000"/>
                 <w:sz w:val="19"/>
               </w:rPr>
               <w:t>Jurassic Park paddock dinosaur</w:t>
@@ -2912,9 +3081,10 @@
           <w:p>
             <w:r>
               <w:rPr>
-                <w:sz w:val="19"/>
-              </w:rPr>
-              <w:t>Top-3 chunks miss the T. rex-escape sentence entirely (title, a dinosaur-list header, and an earlier Velociraptor scene retrieved instead) -&gt; LLM answers "Velociraptor" (wrong).</w:t>
+                <w:color w:val="000000"/>
+                <w:sz w:val="19"/>
+              </w:rPr>
+              <w:t>Top 3 chunks miss the Tyrannosaurus rex sentence. An earlier Velociraptor scene is retrieved instead. Answer: Velociraptor, wrong.</w:t>
             </w:r>
           </w:p>
         </w:tc>
@@ -2925,9 +3095,10 @@
           <w:p>
             <w:r>
               <w:rPr>
-                <w:sz w:val="19"/>
-              </w:rPr>
-              <w:t>Chunk 1 now contains "...allows a Tyrannosaurus rex to escape and attack the touring group" -&gt; retrieval fixed, but the LLM still answers "Dilophosaurus" (wrong; a different dinosaur named two sentences later in the same chunk).</w:t>
+                <w:color w:val="000000"/>
+                <w:sz w:val="19"/>
+              </w:rPr>
+              <w:t>The top chunk now contains the Tyrannosaurus rex sentence. Answer: Dilophosaurus, still wrong, a different dinosaur named two sentences later in the same chunk.</w:t>
             </w:r>
           </w:p>
         </w:tc>
@@ -2940,9 +3111,10 @@
           <w:p>
             <w:r>
               <w:rPr>
-                <w:sz w:val="19"/>
-              </w:rPr>
-              <w:t>Titanic ship &amp; year</w:t>
+                <w:color w:val="000000"/>
+                <w:sz w:val="19"/>
+              </w:rPr>
+              <w:t>Titanic ship and year</w:t>
             </w:r>
           </w:p>
         </w:tc>
@@ -2953,9 +3125,10 @@
           <w:p>
             <w:r>
               <w:rPr>
-                <w:sz w:val="19"/>
-              </w:rPr>
-              <w:t>Chunk 1 contains "...sinking of RMS Titanic in 1912." -&gt; correct answer.</w:t>
+                <w:color w:val="000000"/>
+                <w:sz w:val="19"/>
+              </w:rPr>
+              <w:t>Top chunk contains the sinking of RMS Titanic in 1912. Answer correct.</w:t>
             </w:r>
           </w:p>
         </w:tc>
@@ -2966,9 +3139,10 @@
           <w:p>
             <w:r>
               <w:rPr>
-                <w:sz w:val="19"/>
-              </w:rPr>
-              <w:t>Same fact still present in chunk 1 -&gt; same correct answer, unaffected by the reconfiguration.</w:t>
+                <w:color w:val="000000"/>
+                <w:sz w:val="19"/>
+              </w:rPr>
+              <w:t>Same fact still in the top chunk. Answer correct, unchanged.</w:t>
             </w:r>
           </w:p>
         </w:tc>
@@ -2977,7 +3151,7 @@
     <w:p/>
     <w:p>
       <w:r>
-        <w:t>Larger chunks improved retrieval for the Jurassic Park question (the relevant fact is now present in the top-3), but did not fix the final answer -- the generation step introduced a new failure mode once several dinosaur names appeared together in one larger chunk. The Titanic question was already retrieval-solid at 500/50 and stayed solid at 1000/100.</w:t>
+        <w:t>Bigger chunks fixed retrieval for the Jurassic Park question, but the final answer was still wrong. The Titanic question was already correct at 500/50 and stayed correct at 1000/100.</w:t>
       </w:r>
     </w:p>
     <w:tbl>
@@ -3002,7 +3176,7 @@
           </w:tcPr>
           <w:p>
             <w:pPr>
-              <w:spacing w:before="360" w:after="360"/>
+              <w:spacing w:before="280" w:after="280"/>
               <w:jc w:val="center"/>
             </w:pPr>
             <w:r>
@@ -3013,7 +3187,7 @@
               </w:rPr>
               <w:t>[SCREENSHOT PLACEHOLDER]</w:t>
               <w:br/>
-              <w:t>Notebook cell output showing the rebuilt vector store's chunk count and the re-run retrieved chunks/answers for the Jurassic Park and Titanic questions under the 1000/100 configuration (Part 2, Section 2.6 of the notebook).</w:t>
+              <w:t>Notebook cell showing the rebuilt chunk count and the new retrieved chunks and answers for the Jurassic Park and Titanic questions (Part 2, Section 2.6).</w:t>
             </w:r>
           </w:p>
         </w:tc>
@@ -3025,7 +3199,7 @@
         <w:pStyle w:val="Heading2"/>
       </w:pPr>
       <w:r>
-        <w:t>2.4 Manual retrieval-success assessment (original 500/50 configuration)</w:t>
+        <w:t>2.4 Retrieval success rate (chunk size 500, overlap 50)</w:t>
       </w:r>
     </w:p>
     <w:tbl>
@@ -3057,6 +3231,7 @@
             <w:r>
               <w:rPr>
                 <w:b/>
+                <w:color w:val="000000"/>
                 <w:sz w:val="19"/>
               </w:rPr>
               <w:t>Question</w:t>
@@ -3072,9 +3247,10 @@
             <w:r>
               <w:rPr>
                 <w:b/>
-                <w:sz w:val="19"/>
-              </w:rPr>
-              <w:t>Ground-truth passage</w:t>
+                <w:color w:val="000000"/>
+                <w:sz w:val="19"/>
+              </w:rPr>
+              <w:t>Ground truth passage</w:t>
             </w:r>
           </w:p>
         </w:tc>
@@ -3087,9 +3263,10 @@
             <w:r>
               <w:rPr>
                 <w:b/>
-                <w:sz w:val="19"/>
-              </w:rPr>
-              <w:t>Found in top-3?</w:t>
+                <w:color w:val="000000"/>
+                <w:sz w:val="19"/>
+              </w:rPr>
+              <w:t>Found in top 3</w:t>
             </w:r>
           </w:p>
         </w:tc>
@@ -3102,6 +3279,7 @@
             <w:r>
               <w:rPr>
                 <w:b/>
+                <w:color w:val="000000"/>
                 <w:sz w:val="19"/>
               </w:rPr>
               <w:t>Rank of first relevant chunk</w:t>
@@ -3117,9 +3295,10 @@
           <w:p>
             <w:r>
               <w:rPr>
-                <w:sz w:val="19"/>
-              </w:rPr>
-              <w:t>Inception director &amp; composer</w:t>
+                <w:color w:val="000000"/>
+                <w:sz w:val="19"/>
+              </w:rPr>
+              <w:t>Inception director and composer</w:t>
             </w:r>
           </w:p>
         </w:tc>
@@ -3130,9 +3309,10 @@
           <w:p>
             <w:r>
               <w:rPr>
-                <w:sz w:val="19"/>
-              </w:rPr>
-              <w:t>"...directed by Christopher Nolan..." / "The score for Inception was composed...by Hans Zimmer"</w:t>
+                <w:color w:val="000000"/>
+                <w:sz w:val="19"/>
+              </w:rPr>
+              <w:t>directed by Christopher Nolan / score composed by Hans Zimmer</w:t>
             </w:r>
           </w:p>
         </w:tc>
@@ -3143,6 +3323,7 @@
           <w:p>
             <w:r>
               <w:rPr>
+                <w:color w:val="000000"/>
                 <w:sz w:val="19"/>
               </w:rPr>
               <w:t>Yes</w:t>
@@ -3156,6 +3337,7 @@
           <w:p>
             <w:r>
               <w:rPr>
+                <w:color w:val="000000"/>
                 <w:sz w:val="19"/>
               </w:rPr>
               <w:t>1</w:t>
@@ -3171,9 +3353,10 @@
           <w:p>
             <w:r>
               <w:rPr>
-                <w:sz w:val="19"/>
-              </w:rPr>
-              <w:t>Andy Dufresne's profession</w:t>
+                <w:color w:val="000000"/>
+                <w:sz w:val="19"/>
+              </w:rPr>
+              <w:t>Andy Dufresne profession</w:t>
             </w:r>
           </w:p>
         </w:tc>
@@ -3184,9 +3367,10 @@
           <w:p>
             <w:r>
               <w:rPr>
-                <w:sz w:val="19"/>
-              </w:rPr>
-              <w:t>"...banker Andy Dufresne arrives at Shawshank State Prison..."</w:t>
+                <w:color w:val="000000"/>
+                <w:sz w:val="19"/>
+              </w:rPr>
+              <w:t>banker Andy Dufresne arrives at Shawshank State Prison</w:t>
             </w:r>
           </w:p>
         </w:tc>
@@ -3197,6 +3381,7 @@
           <w:p>
             <w:r>
               <w:rPr>
+                <w:color w:val="000000"/>
                 <w:sz w:val="19"/>
               </w:rPr>
               <w:t>Yes</w:t>
@@ -3210,6 +3395,7 @@
           <w:p>
             <w:r>
               <w:rPr>
+                <w:color w:val="000000"/>
                 <w:sz w:val="19"/>
               </w:rPr>
               <w:t>1</w:t>
@@ -3225,9 +3411,10 @@
           <w:p>
             <w:r>
               <w:rPr>
-                <w:sz w:val="19"/>
-              </w:rPr>
-              <w:t>Titanic ship &amp; sinking year</w:t>
+                <w:color w:val="000000"/>
+                <w:sz w:val="19"/>
+              </w:rPr>
+              <w:t>Titanic ship and year</w:t>
             </w:r>
           </w:p>
         </w:tc>
@@ -3238,9 +3425,10 @@
           <w:p>
             <w:r>
               <w:rPr>
-                <w:sz w:val="19"/>
-              </w:rPr>
-              <w:t>"...based on accounts of the sinking of RMS Titanic in 1912."</w:t>
+                <w:color w:val="000000"/>
+                <w:sz w:val="19"/>
+              </w:rPr>
+              <w:t>sinking of RMS Titanic in 1912</w:t>
             </w:r>
           </w:p>
         </w:tc>
@@ -3251,6 +3439,7 @@
           <w:p>
             <w:r>
               <w:rPr>
+                <w:color w:val="000000"/>
                 <w:sz w:val="19"/>
               </w:rPr>
               <w:t>Yes</w:t>
@@ -3264,6 +3453,7 @@
           <w:p>
             <w:r>
               <w:rPr>
+                <w:color w:val="000000"/>
                 <w:sz w:val="19"/>
               </w:rPr>
               <w:t>1</w:t>
@@ -3279,6 +3469,7 @@
           <w:p>
             <w:r>
               <w:rPr>
+                <w:color w:val="000000"/>
                 <w:sz w:val="19"/>
               </w:rPr>
               <w:t>Matrix character played by Keanu Reeves</w:t>
@@ -3292,9 +3483,10 @@
           <w:p>
             <w:r>
               <w:rPr>
-                <w:sz w:val="19"/>
-              </w:rPr>
-              <w:t>"Keanu Reeves as Neo: A computer programmer..."</w:t>
+                <w:color w:val="000000"/>
+                <w:sz w:val="19"/>
+              </w:rPr>
+              <w:t>Keanu Reeves as Neo</w:t>
             </w:r>
           </w:p>
         </w:tc>
@@ -3305,6 +3497,7 @@
           <w:p>
             <w:r>
               <w:rPr>
+                <w:color w:val="000000"/>
                 <w:sz w:val="19"/>
               </w:rPr>
               <w:t>Yes</w:t>
@@ -3318,6 +3511,7 @@
           <w:p>
             <w:r>
               <w:rPr>
+                <w:color w:val="000000"/>
                 <w:sz w:val="19"/>
               </w:rPr>
               <w:t>1</w:t>
@@ -3333,9 +3527,10 @@
           <w:p>
             <w:r>
               <w:rPr>
-                <w:sz w:val="19"/>
-              </w:rPr>
-              <w:t>Jurassic Park paddock-breakout dinosaur</w:t>
+                <w:color w:val="000000"/>
+                <w:sz w:val="19"/>
+              </w:rPr>
+              <w:t>Jurassic Park paddock dinosaur</w:t>
             </w:r>
           </w:p>
         </w:tc>
@@ -3346,9 +3541,10 @@
           <w:p>
             <w:r>
               <w:rPr>
-                <w:sz w:val="19"/>
-              </w:rPr>
-              <w:t>"...allows a Tyrannosaurus rex to escape and attack the touring group."</w:t>
+                <w:color w:val="000000"/>
+                <w:sz w:val="19"/>
+              </w:rPr>
+              <w:t>allows a Tyrannosaurus rex to escape and attack the touring group</w:t>
             </w:r>
           </w:p>
         </w:tc>
@@ -3359,6 +3555,7 @@
           <w:p>
             <w:r>
               <w:rPr>
+                <w:color w:val="000000"/>
                 <w:sz w:val="19"/>
               </w:rPr>
               <w:t>No</w:t>
@@ -3372,6 +3569,7 @@
           <w:p>
             <w:r>
               <w:rPr>
+                <w:color w:val="000000"/>
                 <w:sz w:val="19"/>
               </w:rPr>
               <w:t>N/A</w:t>
@@ -3383,7 +3581,7 @@
     <w:p/>
     <w:p>
       <w:r>
-        <w:t>Retrieval Success Rate = 4 / 5 = 80%.</w:t>
+        <w:t>Retrieval success rate: 4 of 5, 80 percent.</w:t>
       </w:r>
     </w:p>
     <w:tbl>
@@ -3408,7 +3606,7 @@
           </w:tcPr>
           <w:p>
             <w:pPr>
-              <w:spacing w:before="360" w:after="360"/>
+              <w:spacing w:before="280" w:after="280"/>
               <w:jc w:val="center"/>
             </w:pPr>
             <w:r>
@@ -3419,7 +3617,7 @@
               </w:rPr>
               <w:t>[SCREENSHOT PLACEHOLDER]</w:t>
               <w:br/>
-              <w:t>Notebook cell output showing the manual assessment table and the computed Retrieval Success Rate (Part 2, Section 2.7 of the notebook).</w:t>
+              <w:t>Notebook cell showing the retrieval success table and the computed rate (Part 2, Section 2.7).</w:t>
             </w:r>
           </w:p>
         </w:tc>
@@ -3436,17 +3634,17 @@
     </w:p>
     <w:p>
       <w:r>
-        <w:t>Failure 1 -- correct chunk not retrieved, LLM hallucinates (Jurassic Park, original config, 500/50). The sentence describing the T. rex's paddock escape falls into a chunk that never surfaces in the top-3; the retriever instead returns the page title, a bare "List" section header, and an earlier scene where a Velociraptor kills a park worker. Because "Velociraptor" is present in the retrieved context (from that unrelated scene) while the actual answer is not, the LLM confidently answers "Velociraptor" -- the correct document was effectively not retrieved, and the model filled the gap with a superficially plausible but wrong entity from the context it did receive.</w:t>
+        <w:t>Failure 1: retrieval miss causes a wrong answer. At chunk size 500, the sentence about the Tyrannosaurus rex escaping its paddock is not in the top 3 chunks. The retriever returns the page title, a list header, and an earlier scene mentioning a Velociraptor. The model answers Velociraptor, which is wrong.</w:t>
       </w:r>
     </w:p>
     <w:p>
       <w:r>
-        <w:t>Failure 2 -- correct context retrieved, but the LLM still answers incorrectly (Jurassic Park, reconfigured, 1000/100). After widening the chunk size, the correct sentence about the Tyrannosaurus rex is present in the top-1 retrieved chunk. Despite the right fact being present, the LLM answers "Dilophosaurus" -- a different dinosaur mentioned two sentences later in the same chunk (Nedry is killed by "a venom-spitting Dilophosaurus"). This is a pure generation failure: the small (0.5B parameter) instruction-tuned model had the right context but failed to correctly attribute the "escapes its paddock" action to the right entity once multiple dinosaur names competed within the same passage. It shows that fixing retrieval does not guarantee a correct final answer.</w:t>
+        <w:t>Failure 2: correct context retrieved, wrong answer generated. At chunk size 1000, the correct sentence about the Tyrannosaurus rex is in the top chunk. The model still answers Dilophosaurus, a different dinosaur named two sentences later in the same chunk. This shows that fixing retrieval does not guarantee a correct answer.</w:t>
       </w:r>
     </w:p>
     <w:p>
       <w:r>
-        <w:t>Contributing factor -- ambiguous / overlapping entity names. Both failures share a root cause: the Jurassic Park plot passage densely packs multiple named dinosaur species into adjacent sentences (Velociraptor, Tyrannosaurus rex, Dilophosaurus, Brachiosaurus). This is a specific case of ambiguous-entity confusion -- not movie-title ambiguity, but in-document entity crowding that confuses both the retriever's chunk selection and the reader's attribution.</w:t>
+        <w:t>Both failures come from several dinosaur names appearing close together in one passage, which confuses both retrieval and generation.</w:t>
       </w:r>
     </w:p>
     <w:p>
@@ -3454,7 +3652,7 @@
         <w:pStyle w:val="Heading1"/>
       </w:pPr>
       <w:r>
-        <w:t>3. Training-Time Optimization Techniques</w:t>
+        <w:t>3. Training Time Optimization Techniques</w:t>
       </w:r>
     </w:p>
     <w:p>
@@ -3462,12 +3660,12 @@
         <w:pStyle w:val="Heading2"/>
       </w:pPr>
       <w:r>
-        <w:t>3.1 Shared experimental setup</w:t>
+        <w:t>3.1 Shared setup</w:t>
       </w:r>
     </w:p>
     <w:p>
       <w:r>
-        <w:t>Model: an 8-layer Transformer-encoder classifier (d_model=384, 6 heads, feedforward dim=1536). Data: a single fixed synthetic batch (batch_size=64, seq_len=256, embed_dim=384, random binary labels), generated once with a fixed seed and reused unchanged across every experiment. Training: 20 steps per run, repeatedly training on the same fixed batch. Hardware: Apple Silicon GPU (Metal / MPS backend); no CUDA GPU was available, so CUDA-specific memory APIs (torch.cuda.memory_allocated) were replaced with torch.mps.current_allocated_memory(), sampled at the point in each training step where the technique's effect would show up (peak activation memory is highest right after the forward pass, before backward frees intermediate activations).</w:t>
+        <w:t>Model: an 8 layer Transformer encoder classifier, 384 dimensions, 6 heads. Data: one fixed random batch, batch size 64, sequence length 256, reused for every experiment. Training: 20 steps per run on the same batch. Hardware: Apple Silicon GPU, MPS backend, no CUDA available. Memory was read with torch.mps.current_allocated_memory(), sampled right after the forward pass, since CUDA memory functions are not available on this machine.</w:t>
       </w:r>
     </w:p>
     <w:p>
@@ -3475,21 +3673,21 @@
         <w:pStyle w:val="Heading2"/>
       </w:pPr>
       <w:r>
-        <w:t>3.2 Tensor Creation: CPU vs. GPU</w:t>
+        <w:t>3.2 Tensor creation, CPU vs GPU</w:t>
       </w:r>
     </w:p>
     <w:p>
       <w:r>
-        <w:t>Tensor creation snippet:</w:t>
+        <w:rPr>
+          <w:rFonts w:ascii="Consolas" w:hAnsi="Consolas"/>
+          <w:sz w:val="18"/>
+        </w:rPr>
+        <w:t>x_cpu = torch.randn(64, 256, 384)                 # CPU tensor</w:t>
+        <w:br/>
+        <w:t>x_gpu = torch.randn(64, 256, 384, device="mps")    # GPU tensor</w:t>
       </w:r>
     </w:p>
-    <w:p>
-      <w:r>
-        <w:t>x_cpu = torch.randn(64, 256, 384)                      # lives in system RAM, ops run on CPU</w:t>
-        <w:br/>
-        <w:t>x_gpu = torch.randn(64, 256, 384, device="mps")       # created directly on GPU</w:t>
-      </w:r>
-    </w:p>
+    <w:p/>
     <w:tbl>
       <w:tblPr>
         <w:tblW w:type="auto" w:w="0"/>
@@ -3519,6 +3717,7 @@
             <w:r>
               <w:rPr>
                 <w:b/>
+                <w:color w:val="000000"/>
                 <w:sz w:val="19"/>
               </w:rPr>
               <w:t>Device</w:t>
@@ -3534,9 +3733,10 @@
             <w:r>
               <w:rPr>
                 <w:b/>
-                <w:sz w:val="19"/>
-              </w:rPr>
-              <w:t>Time (20 steps)</w:t>
+                <w:color w:val="000000"/>
+                <w:sz w:val="19"/>
+              </w:rPr>
+              <w:t>Time, 20 steps</w:t>
             </w:r>
           </w:p>
         </w:tc>
@@ -3549,6 +3749,7 @@
             <w:r>
               <w:rPr>
                 <w:b/>
+                <w:color w:val="000000"/>
                 <w:sz w:val="19"/>
               </w:rPr>
               <w:t>Peak memory</w:t>
@@ -3564,9 +3765,10 @@
             <w:r>
               <w:rPr>
                 <w:b/>
-                <w:sz w:val="19"/>
-              </w:rPr>
-              <w:t>Loss (start -&gt; end)</w:t>
+                <w:color w:val="000000"/>
+                <w:sz w:val="19"/>
+              </w:rPr>
+              <w:t>Loss, start → end</w:t>
             </w:r>
           </w:p>
         </w:tc>
@@ -3579,6 +3781,7 @@
           <w:p>
             <w:r>
               <w:rPr>
+                <w:color w:val="000000"/>
                 <w:sz w:val="19"/>
               </w:rPr>
               <w:t>CPU</w:t>
@@ -3592,6 +3795,7 @@
           <w:p>
             <w:r>
               <w:rPr>
+                <w:color w:val="000000"/>
                 <w:sz w:val="19"/>
               </w:rPr>
               <w:t>67.63 s</w:t>
@@ -3605,9 +3809,10 @@
           <w:p>
             <w:r>
               <w:rPr>
-                <w:sz w:val="19"/>
-              </w:rPr>
-              <w:t>7783.9 MB (process RSS)</w:t>
+                <w:color w:val="000000"/>
+                <w:sz w:val="19"/>
+              </w:rPr>
+              <w:t>7783.9 MB</w:t>
             </w:r>
           </w:p>
         </w:tc>
@@ -3618,9 +3823,10 @@
           <w:p>
             <w:r>
               <w:rPr>
-                <w:sz w:val="19"/>
-              </w:rPr>
-              <w:t>0.7021 -&gt; 0.6972</w:t>
+                <w:color w:val="000000"/>
+                <w:sz w:val="19"/>
+              </w:rPr>
+              <w:t>0.7021 → 0.6972</w:t>
             </w:r>
           </w:p>
         </w:tc>
@@ -3633,6 +3839,7 @@
           <w:p>
             <w:r>
               <w:rPr>
+                <w:color w:val="000000"/>
                 <w:sz w:val="19"/>
               </w:rPr>
               <w:t>MPS (GPU)</w:t>
@@ -3646,6 +3853,7 @@
           <w:p>
             <w:r>
               <w:rPr>
+                <w:color w:val="000000"/>
                 <w:sz w:val="19"/>
               </w:rPr>
               <w:t>32.82 s</w:t>
@@ -3659,9 +3867,10 @@
           <w:p>
             <w:r>
               <w:rPr>
-                <w:sz w:val="19"/>
-              </w:rPr>
-              <w:t>7078.0 MB (MPS allocator)</w:t>
+                <w:color w:val="000000"/>
+                <w:sz w:val="19"/>
+              </w:rPr>
+              <w:t>7078.0 MB</w:t>
             </w:r>
           </w:p>
         </w:tc>
@@ -3672,9 +3881,10 @@
           <w:p>
             <w:r>
               <w:rPr>
-                <w:sz w:val="19"/>
-              </w:rPr>
-              <w:t>0.7004 -&gt; 0.6858</w:t>
+                <w:color w:val="000000"/>
+                <w:sz w:val="19"/>
+              </w:rPr>
+              <w:t>0.7004 → 0.6858</w:t>
             </w:r>
           </w:p>
         </w:tc>
@@ -3683,7 +3893,7 @@
     <w:p/>
     <w:p>
       <w:r>
-        <w:t>MPS speedup over CPU: 2.06x for the identical model, data, batch size, and step count. Final loss values match closely, confirming both runs perform the same computation on different hardware. Peak-memory figures are not directly comparable across devices here: the CPU number is whole-process resident memory, while the MPS number is the PyTorch MPS allocator's live-tensor count.</w:t>
+        <w:t>MPS was 2.06 times faster than CPU for the same model, data, and steps. Final loss values are close, so both runs did the same computation on different hardware. The two memory numbers are not directly comparable: CPU memory is whole process memory, MPS memory is the allocator's live tensor count.</w:t>
       </w:r>
     </w:p>
     <w:tbl>
@@ -3708,7 +3918,7 @@
           </w:tcPr>
           <w:p>
             <w:pPr>
-              <w:spacing w:before="360" w:after="360"/>
+              <w:spacing w:before="280" w:after="280"/>
               <w:jc w:val="center"/>
             </w:pPr>
             <w:r>
@@ -3719,7 +3929,7 @@
               </w:rPr>
               <w:t>[SCREENSHOT PLACEHOLDER]</w:t>
               <w:br/>
-              <w:t>Notebook cell output showing the CPU vs MPS timing/memory/loss print statements and the computed speedup (Part 3, Section 1 of the notebook).</w:t>
+              <w:t>Notebook cell showing the CPU and MPS time, memory, and loss output, and the computed speedup (Part 3, Section 1).</w:t>
             </w:r>
           </w:p>
         </w:tc>
@@ -3731,14 +3941,21 @@
         <w:pStyle w:val="Heading2"/>
       </w:pPr>
       <w:r>
-        <w:t>3.3 Weight Initialization</w:t>
+        <w:t>3.3 Weight initialization</w:t>
       </w:r>
     </w:p>
     <w:p>
       <w:r>
-        <w:t>Compared PyTorch's default (Kaiming-uniform) initialization against Xavier/Glorot uniform and a degenerate all-zeros baseline, applied to every nn.Linear layer.</w:t>
+        <w:rPr>
+          <w:rFonts w:ascii="Consolas" w:hAnsi="Consolas"/>
+          <w:sz w:val="18"/>
+        </w:rPr>
+        <w:t>nn.init.xavier_uniform_(layer.weight)   # Xavier</w:t>
+        <w:br/>
+        <w:t>nn.init.zeros_(layer.weight)             # all zeros baseline</w:t>
       </w:r>
     </w:p>
+    <w:p/>
     <w:tbl>
       <w:tblPr>
         <w:tblW w:type="auto" w:w="0"/>
@@ -3768,6 +3985,7 @@
             <w:r>
               <w:rPr>
                 <w:b/>
+                <w:color w:val="000000"/>
                 <w:sz w:val="19"/>
               </w:rPr>
               <w:t>Init scheme</w:t>
@@ -3783,9 +4001,10 @@
             <w:r>
               <w:rPr>
                 <w:b/>
-                <w:sz w:val="19"/>
-              </w:rPr>
-              <w:t>Time (20 steps)</w:t>
+                <w:color w:val="000000"/>
+                <w:sz w:val="19"/>
+              </w:rPr>
+              <w:t>Time, 20 steps</w:t>
             </w:r>
           </w:p>
         </w:tc>
@@ -3798,6 +4017,7 @@
             <w:r>
               <w:rPr>
                 <w:b/>
+                <w:color w:val="000000"/>
                 <w:sz w:val="19"/>
               </w:rPr>
               <w:t>Peak memory</w:t>
@@ -3813,9 +4033,10 @@
             <w:r>
               <w:rPr>
                 <w:b/>
-                <w:sz w:val="19"/>
-              </w:rPr>
-              <w:t>Loss (start -&gt; end)</w:t>
+                <w:color w:val="000000"/>
+                <w:sz w:val="19"/>
+              </w:rPr>
+              <w:t>Loss, start → end</w:t>
             </w:r>
           </w:p>
         </w:tc>
@@ -3828,6 +4049,7 @@
           <w:p>
             <w:r>
               <w:rPr>
+                <w:color w:val="000000"/>
                 <w:sz w:val="19"/>
               </w:rPr>
               <w:t>default (Kaiming)</w:t>
@@ -3841,6 +4063,7 @@
           <w:p>
             <w:r>
               <w:rPr>
+                <w:color w:val="000000"/>
                 <w:sz w:val="19"/>
               </w:rPr>
               <w:t>42.87 s</w:t>
@@ -3854,6 +4077,7 @@
           <w:p>
             <w:r>
               <w:rPr>
+                <w:color w:val="000000"/>
                 <w:sz w:val="19"/>
               </w:rPr>
               <w:t>7077.4 MB</w:t>
@@ -3867,9 +4091,10 @@
           <w:p>
             <w:r>
               <w:rPr>
-                <w:sz w:val="19"/>
-              </w:rPr>
-              <w:t>0.7004 -&gt; 0.6858</w:t>
+                <w:color w:val="000000"/>
+                <w:sz w:val="19"/>
+              </w:rPr>
+              <w:t>0.7004 → 0.6858</w:t>
             </w:r>
           </w:p>
         </w:tc>
@@ -3882,6 +4107,7 @@
           <w:p>
             <w:r>
               <w:rPr>
+                <w:color w:val="000000"/>
                 <w:sz w:val="19"/>
               </w:rPr>
               <w:t>Xavier</w:t>
@@ -3895,6 +4121,7 @@
           <w:p>
             <w:r>
               <w:rPr>
+                <w:color w:val="000000"/>
                 <w:sz w:val="19"/>
               </w:rPr>
               <w:t>43.19 s</w:t>
@@ -3908,6 +4135,7 @@
           <w:p>
             <w:r>
               <w:rPr>
+                <w:color w:val="000000"/>
                 <w:sz w:val="19"/>
               </w:rPr>
               <w:t>7079.1 MB</w:t>
@@ -3921,9 +4149,10 @@
           <w:p>
             <w:r>
               <w:rPr>
-                <w:sz w:val="19"/>
-              </w:rPr>
-              <w:t>0.7439 -&gt; 0.7452</w:t>
+                <w:color w:val="000000"/>
+                <w:sz w:val="19"/>
+              </w:rPr>
+              <w:t>0.7439 → 0.7452</w:t>
             </w:r>
           </w:p>
         </w:tc>
@@ -3936,6 +4165,7 @@
           <w:p>
             <w:r>
               <w:rPr>
+                <w:color w:val="000000"/>
                 <w:sz w:val="19"/>
               </w:rPr>
               <w:t>zeros</w:t>
@@ -3949,6 +4179,7 @@
           <w:p>
             <w:r>
               <w:rPr>
+                <w:color w:val="000000"/>
                 <w:sz w:val="19"/>
               </w:rPr>
               <w:t>43.60 s</w:t>
@@ -3962,6 +4193,7 @@
           <w:p>
             <w:r>
               <w:rPr>
+                <w:color w:val="000000"/>
                 <w:sz w:val="19"/>
               </w:rPr>
               <w:t>7078.1 MB</w:t>
@@ -3975,9 +4207,10 @@
           <w:p>
             <w:r>
               <w:rPr>
-                <w:sz w:val="19"/>
-              </w:rPr>
-              <w:t>0.6931 -&gt; 0.3431</w:t>
+                <w:color w:val="000000"/>
+                <w:sz w:val="19"/>
+              </w:rPr>
+              <w:t>0.6931 → 0.3431</w:t>
             </w:r>
           </w:p>
         </w:tc>
@@ -3986,7 +4219,7 @@
     <w:p/>
     <w:p>
       <w:r>
-        <w:t>Default init starts near ln(2) = 0.693 (expected for a balanced 2-class softmax at initialization) and descends smoothly. Xavier starts at a much higher initial loss for this architecture (the Transformer layers' own LayerNorm-scaled sublayers interact with Xavier's differently-scaled weights) and does not recover within 20 steps -- it plateaus/drifts slightly upward instead of decreasing. Zeros-initialized linear layers still manage to reduce loss substantially, because the model's residual ("skip") connections let gradients flow through the untouched input path even when a sublayer's own weights start at exactly zero -- residual architectures are comparatively robust to some forms of poor initialization, unlike a plain deep MLP with zero-initialized weights, which would never break symmetry and would not train at all.</w:t>
+        <w:t>Default init decreases smoothly. Xavier starts higher and does not recover within 20 steps. Zeros still trains because of residual connections, which let gradients skip the zeroed layers.</w:t>
       </w:r>
     </w:p>
     <w:tbl>
@@ -4011,7 +4244,7 @@
           </w:tcPr>
           <w:p>
             <w:pPr>
-              <w:spacing w:before="360" w:after="360"/>
+              <w:spacing w:before="280" w:after="280"/>
               <w:jc w:val="center"/>
             </w:pPr>
             <w:r>
@@ -4022,7 +4255,7 @@
               </w:rPr>
               <w:t>[SCREENSHOT PLACEHOLDER]</w:t>
               <w:br/>
-              <w:t>Notebook cell output showing the three initialization schemes' time/memory/loss print statements, and the loss-over-steps line plot comparing all three (Part 3, Section 2 of the notebook).</w:t>
+              <w:t>Notebook cell showing the three init schemes' time, memory, loss output, and the loss over steps plot (Part 3, Section 2).</w:t>
             </w:r>
           </w:p>
         </w:tc>
@@ -4034,21 +4267,21 @@
         <w:pStyle w:val="Heading2"/>
       </w:pPr>
       <w:r>
-        <w:t>3.4 Activation Checkpointing</w:t>
+        <w:t>3.4 Activation checkpointing</w:t>
       </w:r>
     </w:p>
     <w:p>
       <w:r>
-        <w:t>Checkpointing snippet:</w:t>
+        <w:rPr>
+          <w:rFonts w:ascii="Consolas" w:hAnsi="Consolas"/>
+          <w:sz w:val="18"/>
+        </w:rPr>
+        <w:t>x = layer(x)                                             # normal</w:t>
+        <w:br/>
+        <w:t>x = torch.utils.checkpoint.checkpoint(layer, x, use_reentrant=False)  # checkpointed</w:t>
       </w:r>
     </w:p>
-    <w:p>
-      <w:r>
-        <w:t>x = layer(x)                                              # normal: activations retained</w:t>
-        <w:br/>
-        <w:t>x = torch.utils.checkpoint.checkpoint(layer, x, use_reentrant=False)  # recomputed in backward</w:t>
-      </w:r>
-    </w:p>
+    <w:p/>
     <w:tbl>
       <w:tblPr>
         <w:tblW w:type="auto" w:w="0"/>
@@ -4078,6 +4311,7 @@
             <w:r>
               <w:rPr>
                 <w:b/>
+                <w:color w:val="000000"/>
                 <w:sz w:val="19"/>
               </w:rPr>
               <w:t>Configuration</w:t>
@@ -4093,9 +4327,10 @@
             <w:r>
               <w:rPr>
                 <w:b/>
-                <w:sz w:val="19"/>
-              </w:rPr>
-              <w:t>Time (20 steps)</w:t>
+                <w:color w:val="000000"/>
+                <w:sz w:val="19"/>
+              </w:rPr>
+              <w:t>Time, 20 steps</w:t>
             </w:r>
           </w:p>
         </w:tc>
@@ -4108,6 +4343,7 @@
             <w:r>
               <w:rPr>
                 <w:b/>
+                <w:color w:val="000000"/>
                 <w:sz w:val="19"/>
               </w:rPr>
               <w:t>Peak activation memory</w:t>
@@ -4123,9 +4359,10 @@
             <w:r>
               <w:rPr>
                 <w:b/>
-                <w:sz w:val="19"/>
-              </w:rPr>
-              <w:t>Loss (start -&gt; end)</w:t>
+                <w:color w:val="000000"/>
+                <w:sz w:val="19"/>
+              </w:rPr>
+              <w:t>Loss, start → end</w:t>
             </w:r>
           </w:p>
         </w:tc>
@@ -4138,6 +4375,7 @@
           <w:p>
             <w:r>
               <w:rPr>
+                <w:color w:val="000000"/>
                 <w:sz w:val="19"/>
               </w:rPr>
               <w:t>No checkpointing</w:t>
@@ -4151,6 +4389,7 @@
           <w:p>
             <w:r>
               <w:rPr>
+                <w:color w:val="000000"/>
                 <w:sz w:val="19"/>
               </w:rPr>
               <w:t>47.68 s</w:t>
@@ -4164,6 +4403,7 @@
           <w:p>
             <w:r>
               <w:rPr>
+                <w:color w:val="000000"/>
                 <w:sz w:val="19"/>
               </w:rPr>
               <w:t>7078.5 MB</w:t>
@@ -4177,9 +4417,10 @@
           <w:p>
             <w:r>
               <w:rPr>
-                <w:sz w:val="19"/>
-              </w:rPr>
-              <w:t>0.7004 -&gt; 0.6858</w:t>
+                <w:color w:val="000000"/>
+                <w:sz w:val="19"/>
+              </w:rPr>
+              <w:t>0.7004 → 0.6858</w:t>
             </w:r>
           </w:p>
         </w:tc>
@@ -4192,6 +4433,7 @@
           <w:p>
             <w:r>
               <w:rPr>
+                <w:color w:val="000000"/>
                 <w:sz w:val="19"/>
               </w:rPr>
               <w:t>With checkpointing</w:t>
@@ -4205,6 +4447,7 @@
           <w:p>
             <w:r>
               <w:rPr>
+                <w:color w:val="000000"/>
                 <w:sz w:val="19"/>
               </w:rPr>
               <w:t>52.39 s</w:t>
@@ -4218,6 +4461,7 @@
           <w:p>
             <w:r>
               <w:rPr>
+                <w:color w:val="000000"/>
                 <w:sz w:val="19"/>
               </w:rPr>
               <w:t>357.1 MB</w:t>
@@ -4231,9 +4475,10 @@
           <w:p>
             <w:r>
               <w:rPr>
-                <w:sz w:val="19"/>
-              </w:rPr>
-              <w:t>0.7004 -&gt; 0.6886</w:t>
+                <w:color w:val="000000"/>
+                <w:sz w:val="19"/>
+              </w:rPr>
+              <w:t>0.7004 → 0.6886</w:t>
             </w:r>
           </w:p>
         </w:tc>
@@ -4242,7 +4487,7 @@
     <w:p/>
     <w:p>
       <w:r>
-        <w:t>Peak activation memory is reduced 19.8x, at the cost of a 1.10x increase in wall-clock time (every checkpointed layer's forward computation runs a second time during backward). Final training loss is essentially unchanged -- checkpointing is purely a memory/compute trade-off, not a modeling change.</w:t>
+        <w:t>Checkpointing cuts peak activation memory by about 20 times, at the cost of about 10 percent more time, since checkpointed layers are recomputed during backward.</w:t>
       </w:r>
     </w:p>
     <w:tbl>
@@ -4267,7 +4512,7 @@
           </w:tcPr>
           <w:p>
             <w:pPr>
-              <w:spacing w:before="360" w:after="360"/>
+              <w:spacing w:before="280" w:after="280"/>
               <w:jc w:val="center"/>
             </w:pPr>
             <w:r>
@@ -4278,7 +4523,7 @@
               </w:rPr>
               <w:t>[SCREENSHOT PLACEHOLDER]</w:t>
               <w:br/>
-              <w:t>Notebook cell output showing the with/without-checkpointing time, peak-activation-memory, and loss print statements, plus the computed memory-reduction and time-overhead ratios (Part 3, Section 3 of the notebook).</w:t>
+              <w:t>Notebook cell showing the with and without checkpointing time, memory, and loss output (Part 3, Section 3).</w:t>
             </w:r>
           </w:p>
         </w:tc>
@@ -4290,29 +4535,29 @@
         <w:pStyle w:val="Heading2"/>
       </w:pPr>
       <w:r>
-        <w:t>3.5 Gradient Accumulation</w:t>
+        <w:t>3.5 Gradient accumulation</w:t>
       </w:r>
     </w:p>
     <w:p>
       <w:r>
-        <w:t>Gradient accumulation snippet:</w:t>
-      </w:r>
-    </w:p>
-    <w:p>
-      <w:r>
+        <w:rPr>
+          <w:rFonts w:ascii="Consolas" w:hAnsi="Consolas"/>
+          <w:sz w:val="18"/>
+        </w:rPr>
         <w:t>optimizer.zero_grad()</w:t>
         <w:br/>
-        <w:t>for micro_x, micro_y in micro_batches:                # 4 micro-batches of size 16 = batch 64</w:t>
+        <w:t>for micro_x, micro_y in microbatches:      # 4 microbatches of size 16</w:t>
         <w:br/>
         <w:t xml:space="preserve">    out = model(micro_x)</w:t>
         <w:br/>
-        <w:t xml:space="preserve">    loss = loss_fn(out, micro_y) / len(micro_batches)</w:t>
+        <w:t xml:space="preserve">    loss = loss_fn(out, micro_y) / 4</w:t>
         <w:br/>
-        <w:t xml:space="preserve">    loss.backward()                                    # accumulates into .grad</w:t>
+        <w:t xml:space="preserve">    loss.backward()</w:t>
         <w:br/>
-        <w:t>optimizer.step()                                       # one update for the whole batch</w:t>
+        <w:t>optimizer.step()</w:t>
       </w:r>
     </w:p>
+    <w:p/>
     <w:tbl>
       <w:tblPr>
         <w:tblW w:type="auto" w:w="0"/>
@@ -4342,6 +4587,7 @@
             <w:r>
               <w:rPr>
                 <w:b/>
+                <w:color w:val="000000"/>
                 <w:sz w:val="19"/>
               </w:rPr>
               <w:t>Configuration</w:t>
@@ -4357,9 +4603,10 @@
             <w:r>
               <w:rPr>
                 <w:b/>
-                <w:sz w:val="19"/>
-              </w:rPr>
-              <w:t>Time (20 steps)</w:t>
+                <w:color w:val="000000"/>
+                <w:sz w:val="19"/>
+              </w:rPr>
+              <w:t>Time, 20 steps</w:t>
             </w:r>
           </w:p>
         </w:tc>
@@ -4372,6 +4619,7 @@
             <w:r>
               <w:rPr>
                 <w:b/>
+                <w:color w:val="000000"/>
                 <w:sz w:val="19"/>
               </w:rPr>
               <w:t>Peak memory</w:t>
@@ -4387,9 +4635,10 @@
             <w:r>
               <w:rPr>
                 <w:b/>
-                <w:sz w:val="19"/>
-              </w:rPr>
-              <w:t>Loss (start -&gt; end)</w:t>
+                <w:color w:val="000000"/>
+                <w:sz w:val="19"/>
+              </w:rPr>
+              <w:t>Loss, start → end</w:t>
             </w:r>
           </w:p>
         </w:tc>
@@ -4402,9 +4651,10 @@
           <w:p>
             <w:r>
               <w:rPr>
-                <w:sz w:val="19"/>
-              </w:rPr>
-              <w:t>Baseline (batch=64, 1 step)</w:t>
+                <w:color w:val="000000"/>
+                <w:sz w:val="19"/>
+              </w:rPr>
+              <w:t>Baseline, batch 64</w:t>
             </w:r>
           </w:p>
         </w:tc>
@@ -4415,6 +4665,7 @@
           <w:p>
             <w:r>
               <w:rPr>
+                <w:color w:val="000000"/>
                 <w:sz w:val="19"/>
               </w:rPr>
               <w:t>37.29 s</w:t>
@@ -4428,6 +4679,7 @@
           <w:p>
             <w:r>
               <w:rPr>
+                <w:color w:val="000000"/>
                 <w:sz w:val="19"/>
               </w:rPr>
               <w:t>7078.9 MB</w:t>
@@ -4441,9 +4693,10 @@
           <w:p>
             <w:r>
               <w:rPr>
-                <w:sz w:val="19"/>
-              </w:rPr>
-              <w:t>0.7004 -&gt; 0.6858</w:t>
+                <w:color w:val="000000"/>
+                <w:sz w:val="19"/>
+              </w:rPr>
+              <w:t>0.7004 → 0.6858</w:t>
             </w:r>
           </w:p>
         </w:tc>
@@ -4456,9 +4709,10 @@
           <w:p>
             <w:r>
               <w:rPr>
-                <w:sz w:val="19"/>
-              </w:rPr>
-              <w:t>Gradient accumulation (4x micro-batch=16)</w:t>
+                <w:color w:val="000000"/>
+                <w:sz w:val="19"/>
+              </w:rPr>
+              <w:t>4 microbatches of 16</w:t>
             </w:r>
           </w:p>
         </w:tc>
@@ -4469,6 +4723,7 @@
           <w:p>
             <w:r>
               <w:rPr>
+                <w:color w:val="000000"/>
                 <w:sz w:val="19"/>
               </w:rPr>
               <w:t>37.04 s</w:t>
@@ -4482,6 +4737,7 @@
           <w:p>
             <w:r>
               <w:rPr>
+                <w:color w:val="000000"/>
                 <w:sz w:val="19"/>
               </w:rPr>
               <w:t>1971.2 MB</w:t>
@@ -4495,9 +4751,10 @@
           <w:p>
             <w:r>
               <w:rPr>
-                <w:sz w:val="19"/>
-              </w:rPr>
-              <w:t>0.6989 -&gt; 0.6908</w:t>
+                <w:color w:val="000000"/>
+                <w:sz w:val="19"/>
+              </w:rPr>
+              <w:t>0.6989 → 0.6908</w:t>
             </w:r>
           </w:p>
         </w:tc>
@@ -4506,7 +4763,7 @@
     <w:p/>
     <w:p>
       <w:r>
-        <w:t>Splitting the same 64-example batch into 4 micro-batches of 16 reduces peak activation memory by roughly 3.6x with essentially the same wall-clock time and a nearly identical loss trajectory to the full-batch baseline, confirming that gradient accumulation reproduces full-batch training dynamics while trading a small amount of loop overhead for a large memory reduction.</w:t>
+        <w:t>Splitting the batch into 4 microbatches of 16 cuts peak memory by about 3.6 times, with almost no change in time and a nearly identical loss curve.</w:t>
       </w:r>
     </w:p>
     <w:tbl>
@@ -4531,7 +4788,7 @@
           </w:tcPr>
           <w:p>
             <w:pPr>
-              <w:spacing w:before="360" w:after="360"/>
+              <w:spacing w:before="280" w:after="280"/>
               <w:jc w:val="center"/>
             </w:pPr>
             <w:r>
@@ -4542,7 +4799,7 @@
               </w:rPr>
               <w:t>[SCREENSHOT PLACEHOLDER]</w:t>
               <w:br/>
-              <w:t>Notebook cell output showing the baseline vs gradient-accumulation time/memory/loss print statements (Part 3, Section 4 of the notebook).</w:t>
+              <w:t>Notebook cell showing the baseline and gradient accumulation time, memory, and loss output (Part 3, Section 4).</w:t>
             </w:r>
           </w:p>
         </w:tc>
@@ -4554,18 +4811,15 @@
         <w:pStyle w:val="Heading2"/>
       </w:pPr>
       <w:r>
-        <w:t>3.6 Mixed Precision Training</w:t>
+        <w:t>3.6 Mixed precision training</w:t>
       </w:r>
     </w:p>
     <w:p>
       <w:r>
-        <w:t>Mixed precision snippet:</w:t>
-      </w:r>
-    </w:p>
-    <w:p>
-      <w:r>
-        <w:t>optimizer.zero_grad()</w:t>
-        <w:br/>
+        <w:rPr>
+          <w:rFonts w:ascii="Consolas" w:hAnsi="Consolas"/>
+          <w:sz w:val="18"/>
+        </w:rPr>
         <w:t>with torch.autocast(device_type="mps", dtype=torch.float16):</w:t>
         <w:br/>
         <w:t xml:space="preserve">    out = model(x)</w:t>
@@ -4573,10 +4827,9 @@
         <w:t xml:space="preserve">    loss = loss_fn(out, y)</w:t>
         <w:br/>
         <w:t>loss.backward()</w:t>
-        <w:br/>
-        <w:t>optimizer.step()</w:t>
       </w:r>
     </w:p>
+    <w:p/>
     <w:tbl>
       <w:tblPr>
         <w:tblW w:type="auto" w:w="0"/>
@@ -4606,6 +4859,7 @@
             <w:r>
               <w:rPr>
                 <w:b/>
+                <w:color w:val="000000"/>
                 <w:sz w:val="19"/>
               </w:rPr>
               <w:t>Precision</w:t>
@@ -4621,9 +4875,10 @@
             <w:r>
               <w:rPr>
                 <w:b/>
-                <w:sz w:val="19"/>
-              </w:rPr>
-              <w:t>Time (20 steps)</w:t>
+                <w:color w:val="000000"/>
+                <w:sz w:val="19"/>
+              </w:rPr>
+              <w:t>Time, 20 steps</w:t>
             </w:r>
           </w:p>
         </w:tc>
@@ -4636,6 +4891,7 @@
             <w:r>
               <w:rPr>
                 <w:b/>
+                <w:color w:val="000000"/>
                 <w:sz w:val="19"/>
               </w:rPr>
               <w:t>Peak memory</w:t>
@@ -4651,9 +4907,10 @@
             <w:r>
               <w:rPr>
                 <w:b/>
-                <w:sz w:val="19"/>
-              </w:rPr>
-              <w:t>Loss (start -&gt; end)</w:t>
+                <w:color w:val="000000"/>
+                <w:sz w:val="19"/>
+              </w:rPr>
+              <w:t>Loss, start → end</w:t>
             </w:r>
           </w:p>
         </w:tc>
@@ -4666,6 +4923,7 @@
           <w:p>
             <w:r>
               <w:rPr>
+                <w:color w:val="000000"/>
                 <w:sz w:val="19"/>
               </w:rPr>
               <w:t>fp32 (baseline)</w:t>
@@ -4679,6 +4937,7 @@
           <w:p>
             <w:r>
               <w:rPr>
+                <w:color w:val="000000"/>
                 <w:sz w:val="19"/>
               </w:rPr>
               <w:t>37.46 s</w:t>
@@ -4692,6 +4951,7 @@
           <w:p>
             <w:r>
               <w:rPr>
+                <w:color w:val="000000"/>
                 <w:sz w:val="19"/>
               </w:rPr>
               <w:t>7081.1 MB</w:t>
@@ -4705,9 +4965,10 @@
           <w:p>
             <w:r>
               <w:rPr>
-                <w:sz w:val="19"/>
-              </w:rPr>
-              <w:t>0.7004 -&gt; 0.6858</w:t>
+                <w:color w:val="000000"/>
+                <w:sz w:val="19"/>
+              </w:rPr>
+              <w:t>0.7004 → 0.6858</w:t>
             </w:r>
           </w:p>
         </w:tc>
@@ -4720,9 +4981,10 @@
           <w:p>
             <w:r>
               <w:rPr>
-                <w:sz w:val="19"/>
-              </w:rPr>
-              <w:t>Mixed precision (fp16 autocast)</w:t>
+                <w:color w:val="000000"/>
+                <w:sz w:val="19"/>
+              </w:rPr>
+              <w:t>fp16 autocast</w:t>
             </w:r>
           </w:p>
         </w:tc>
@@ -4733,6 +4995,7 @@
           <w:p>
             <w:r>
               <w:rPr>
+                <w:color w:val="000000"/>
                 <w:sz w:val="19"/>
               </w:rPr>
               <w:t>35.09 s</w:t>
@@ -4746,6 +5009,7 @@
           <w:p>
             <w:r>
               <w:rPr>
+                <w:color w:val="000000"/>
                 <w:sz w:val="19"/>
               </w:rPr>
               <w:t>5125.0 MB</w:t>
@@ -4759,9 +5023,10 @@
           <w:p>
             <w:r>
               <w:rPr>
-                <w:sz w:val="19"/>
-              </w:rPr>
-              <w:t>0.7004 -&gt; 0.6853</w:t>
+                <w:color w:val="000000"/>
+                <w:sz w:val="19"/>
+              </w:rPr>
+              <w:t>0.7004 → 0.6853</w:t>
             </w:r>
           </w:p>
         </w:tc>
@@ -4770,7 +5035,7 @@
     <w:p/>
     <w:p>
       <w:r>
-        <w:t>fp16 autocast reduces peak memory by about 28% and gives a modest (~6%) speedup on this Apple Silicon GPU, with final loss essentially matching the fp32 baseline. MPS's fp16 support is comparatively less mature than NVIDIA Tensor Cores under CUDA; on a CUDA GPU, mixed precision typically yields a much larger speedup (often 2-3x) because Tensor Cores execute fp16 matmuls natively at higher throughput than fp32, whereas Apple's GPU has no equivalent dedicated low-precision compute path.</w:t>
+        <w:t>fp16 autocast cuts peak memory by about 28 percent and gives a small speed gain here, with final loss matching the fp32 baseline. Mixed precision speedups are usually larger on CUDA GPUs with tensor cores.</w:t>
       </w:r>
     </w:p>
     <w:tbl>
@@ -4795,7 +5060,7 @@
           </w:tcPr>
           <w:p>
             <w:pPr>
-              <w:spacing w:before="360" w:after="360"/>
+              <w:spacing w:before="280" w:after="280"/>
               <w:jc w:val="center"/>
             </w:pPr>
             <w:r>
@@ -4806,7 +5071,7 @@
               </w:rPr>
               <w:t>[SCREENSHOT PLACEHOLDER]</w:t>
               <w:br/>
-              <w:t>Notebook cell output showing the fp32 vs mixed-precision time/memory/loss print statements (Part 3, Section 5 of the notebook).</w:t>
+              <w:t>Notebook cell showing the fp32 and mixed precision time, memory, and loss output (Part 3, Section 5).</w:t>
             </w:r>
           </w:p>
         </w:tc>
@@ -4818,7 +5083,7 @@
         <w:pStyle w:val="Heading2"/>
       </w:pPr>
       <w:r>
-        <w:t>3.7 Summary across all 5 techniques</w:t>
+        <w:t>3.7 Summary</w:t>
       </w:r>
     </w:p>
     <w:tbl>
@@ -4855,6 +5120,7 @@
             <w:r>
               <w:rPr>
                 <w:b/>
+                <w:color w:val="000000"/>
                 <w:sz w:val="19"/>
               </w:rPr>
               <w:t>Technique</w:t>
@@ -4870,6 +5136,7 @@
             <w:r>
               <w:rPr>
                 <w:b/>
+                <w:color w:val="000000"/>
                 <w:sz w:val="19"/>
               </w:rPr>
               <w:t>Config A</w:t>
@@ -4885,9 +5152,10 @@
             <w:r>
               <w:rPr>
                 <w:b/>
-                <w:sz w:val="19"/>
-              </w:rPr>
-              <w:t>Time A (s)</w:t>
+                <w:color w:val="000000"/>
+                <w:sz w:val="19"/>
+              </w:rPr>
+              <w:t>Time A</w:t>
             </w:r>
           </w:p>
         </w:tc>
@@ -4900,6 +5168,7 @@
             <w:r>
               <w:rPr>
                 <w:b/>
+                <w:color w:val="000000"/>
                 <w:sz w:val="19"/>
               </w:rPr>
               <w:t>Mem A (MB)</w:t>
@@ -4915,9 +5184,10 @@
             <w:r>
               <w:rPr>
                 <w:b/>
-                <w:sz w:val="19"/>
-              </w:rPr>
-              <w:t>Loss A (final)</w:t>
+                <w:color w:val="000000"/>
+                <w:sz w:val="19"/>
+              </w:rPr>
+              <w:t>Loss A</w:t>
             </w:r>
           </w:p>
         </w:tc>
@@ -4930,6 +5200,7 @@
             <w:r>
               <w:rPr>
                 <w:b/>
+                <w:color w:val="000000"/>
                 <w:sz w:val="19"/>
               </w:rPr>
               <w:t>Config B</w:t>
@@ -4945,9 +5216,10 @@
             <w:r>
               <w:rPr>
                 <w:b/>
-                <w:sz w:val="19"/>
-              </w:rPr>
-              <w:t>Time B (s)</w:t>
+                <w:color w:val="000000"/>
+                <w:sz w:val="19"/>
+              </w:rPr>
+              <w:t>Time B</w:t>
             </w:r>
           </w:p>
         </w:tc>
@@ -4960,6 +5232,7 @@
             <w:r>
               <w:rPr>
                 <w:b/>
+                <w:color w:val="000000"/>
                 <w:sz w:val="19"/>
               </w:rPr>
               <w:t>Mem B (MB)</w:t>
@@ -4975,9 +5248,10 @@
             <w:r>
               <w:rPr>
                 <w:b/>
-                <w:sz w:val="19"/>
-              </w:rPr>
-              <w:t>Loss B (final)</w:t>
+                <w:color w:val="000000"/>
+                <w:sz w:val="19"/>
+              </w:rPr>
+              <w:t>Loss B</w:t>
             </w:r>
           </w:p>
         </w:tc>
@@ -4990,9 +5264,10 @@
           <w:p>
             <w:r>
               <w:rPr>
-                <w:sz w:val="19"/>
-              </w:rPr>
-              <w:t>Tensor creation (GPU vs CPU)</w:t>
+                <w:color w:val="000000"/>
+                <w:sz w:val="19"/>
+              </w:rPr>
+              <w:t>Tensor creation</w:t>
             </w:r>
           </w:p>
         </w:tc>
@@ -5003,6 +5278,7 @@
           <w:p>
             <w:r>
               <w:rPr>
+                <w:color w:val="000000"/>
                 <w:sz w:val="19"/>
               </w:rPr>
               <w:t>CPU</w:t>
@@ -5016,9 +5292,10 @@
           <w:p>
             <w:r>
               <w:rPr>
-                <w:sz w:val="19"/>
-              </w:rPr>
-              <w:t>67.63</w:t>
+                <w:color w:val="000000"/>
+                <w:sz w:val="19"/>
+              </w:rPr>
+              <w:t>67.63 s</w:t>
             </w:r>
           </w:p>
         </w:tc>
@@ -5029,6 +5306,7 @@
           <w:p>
             <w:r>
               <w:rPr>
+                <w:color w:val="000000"/>
                 <w:sz w:val="19"/>
               </w:rPr>
               <w:t>7783.9</w:t>
@@ -5042,6 +5320,7 @@
           <w:p>
             <w:r>
               <w:rPr>
+                <w:color w:val="000000"/>
                 <w:sz w:val="19"/>
               </w:rPr>
               <w:t>0.6972</w:t>
@@ -5055,6 +5334,7 @@
           <w:p>
             <w:r>
               <w:rPr>
+                <w:color w:val="000000"/>
                 <w:sz w:val="19"/>
               </w:rPr>
               <w:t>MPS</w:t>
@@ -5068,9 +5348,10 @@
           <w:p>
             <w:r>
               <w:rPr>
-                <w:sz w:val="19"/>
-              </w:rPr>
-              <w:t>32.82</w:t>
+                <w:color w:val="000000"/>
+                <w:sz w:val="19"/>
+              </w:rPr>
+              <w:t>32.82 s</w:t>
             </w:r>
           </w:p>
         </w:tc>
@@ -5081,6 +5362,7 @@
           <w:p>
             <w:r>
               <w:rPr>
+                <w:color w:val="000000"/>
                 <w:sz w:val="19"/>
               </w:rPr>
               <w:t>7078.0</w:t>
@@ -5094,6 +5376,7 @@
           <w:p>
             <w:r>
               <w:rPr>
+                <w:color w:val="000000"/>
                 <w:sz w:val="19"/>
               </w:rPr>
               <w:t>0.6858</w:t>
@@ -5109,9 +5392,10 @@
           <w:p>
             <w:r>
               <w:rPr>
-                <w:sz w:val="19"/>
-              </w:rPr>
-              <w:t>Weight init: default</w:t>
+                <w:color w:val="000000"/>
+                <w:sz w:val="19"/>
+              </w:rPr>
+              <w:t>Weight init default</w:t>
             </w:r>
           </w:p>
         </w:tc>
@@ -5122,6 +5406,7 @@
           <w:p>
             <w:r>
               <w:rPr>
+                <w:color w:val="000000"/>
                 <w:sz w:val="19"/>
               </w:rPr>
               <w:t>default</w:t>
@@ -5135,9 +5420,10 @@
           <w:p>
             <w:r>
               <w:rPr>
-                <w:sz w:val="19"/>
-              </w:rPr>
-              <w:t>42.87</w:t>
+                <w:color w:val="000000"/>
+                <w:sz w:val="19"/>
+              </w:rPr>
+              <w:t>42.87 s</w:t>
             </w:r>
           </w:p>
         </w:tc>
@@ -5148,6 +5434,7 @@
           <w:p>
             <w:r>
               <w:rPr>
+                <w:color w:val="000000"/>
                 <w:sz w:val="19"/>
               </w:rPr>
               <w:t>7077.4</w:t>
@@ -5161,6 +5448,7 @@
           <w:p>
             <w:r>
               <w:rPr>
+                <w:color w:val="000000"/>
                 <w:sz w:val="19"/>
               </w:rPr>
               <w:t>0.6858</w:t>
@@ -5174,9 +5462,10 @@
           <w:p>
             <w:r>
               <w:rPr>
-                <w:sz w:val="19"/>
-              </w:rPr>
-              <w:t>-</w:t>
+                <w:color w:val="000000"/>
+                <w:sz w:val="19"/>
+              </w:rPr>
+              <w:t>N/A</w:t>
             </w:r>
           </w:p>
         </w:tc>
@@ -5187,9 +5476,10 @@
           <w:p>
             <w:r>
               <w:rPr>
-                <w:sz w:val="19"/>
-              </w:rPr>
-              <w:t>-</w:t>
+                <w:color w:val="000000"/>
+                <w:sz w:val="19"/>
+              </w:rPr>
+              <w:t>N/A</w:t>
             </w:r>
           </w:p>
         </w:tc>
@@ -5200,9 +5490,10 @@
           <w:p>
             <w:r>
               <w:rPr>
-                <w:sz w:val="19"/>
-              </w:rPr>
-              <w:t>-</w:t>
+                <w:color w:val="000000"/>
+                <w:sz w:val="19"/>
+              </w:rPr>
+              <w:t>N/A</w:t>
             </w:r>
           </w:p>
         </w:tc>
@@ -5213,9 +5504,10 @@
           <w:p>
             <w:r>
               <w:rPr>
-                <w:sz w:val="19"/>
-              </w:rPr>
-              <w:t>-</w:t>
+                <w:color w:val="000000"/>
+                <w:sz w:val="19"/>
+              </w:rPr>
+              <w:t>N/A</w:t>
             </w:r>
           </w:p>
         </w:tc>
@@ -5228,9 +5520,10 @@
           <w:p>
             <w:r>
               <w:rPr>
-                <w:sz w:val="19"/>
-              </w:rPr>
-              <w:t>Weight init: xavier</w:t>
+                <w:color w:val="000000"/>
+                <w:sz w:val="19"/>
+              </w:rPr>
+              <w:t>Weight init xavier</w:t>
             </w:r>
           </w:p>
         </w:tc>
@@ -5241,6 +5534,7 @@
           <w:p>
             <w:r>
               <w:rPr>
+                <w:color w:val="000000"/>
                 <w:sz w:val="19"/>
               </w:rPr>
               <w:t>xavier</w:t>
@@ -5254,9 +5548,10 @@
           <w:p>
             <w:r>
               <w:rPr>
-                <w:sz w:val="19"/>
-              </w:rPr>
-              <w:t>43.19</w:t>
+                <w:color w:val="000000"/>
+                <w:sz w:val="19"/>
+              </w:rPr>
+              <w:t>43.19 s</w:t>
             </w:r>
           </w:p>
         </w:tc>
@@ -5267,6 +5562,7 @@
           <w:p>
             <w:r>
               <w:rPr>
+                <w:color w:val="000000"/>
                 <w:sz w:val="19"/>
               </w:rPr>
               <w:t>7079.1</w:t>
@@ -5280,6 +5576,7 @@
           <w:p>
             <w:r>
               <w:rPr>
+                <w:color w:val="000000"/>
                 <w:sz w:val="19"/>
               </w:rPr>
               <w:t>0.7452</w:t>
@@ -5293,9 +5590,10 @@
           <w:p>
             <w:r>
               <w:rPr>
-                <w:sz w:val="19"/>
-              </w:rPr>
-              <w:t>-</w:t>
+                <w:color w:val="000000"/>
+                <w:sz w:val="19"/>
+              </w:rPr>
+              <w:t>N/A</w:t>
             </w:r>
           </w:p>
         </w:tc>
@@ -5306,9 +5604,10 @@
           <w:p>
             <w:r>
               <w:rPr>
-                <w:sz w:val="19"/>
-              </w:rPr>
-              <w:t>-</w:t>
+                <w:color w:val="000000"/>
+                <w:sz w:val="19"/>
+              </w:rPr>
+              <w:t>N/A</w:t>
             </w:r>
           </w:p>
         </w:tc>
@@ -5319,9 +5618,10 @@
           <w:p>
             <w:r>
               <w:rPr>
-                <w:sz w:val="19"/>
-              </w:rPr>
-              <w:t>-</w:t>
+                <w:color w:val="000000"/>
+                <w:sz w:val="19"/>
+              </w:rPr>
+              <w:t>N/A</w:t>
             </w:r>
           </w:p>
         </w:tc>
@@ -5332,9 +5632,10 @@
           <w:p>
             <w:r>
               <w:rPr>
-                <w:sz w:val="19"/>
-              </w:rPr>
-              <w:t>-</w:t>
+                <w:color w:val="000000"/>
+                <w:sz w:val="19"/>
+              </w:rPr>
+              <w:t>N/A</w:t>
             </w:r>
           </w:p>
         </w:tc>
@@ -5347,9 +5648,10 @@
           <w:p>
             <w:r>
               <w:rPr>
-                <w:sz w:val="19"/>
-              </w:rPr>
-              <w:t>Weight init: zeros</w:t>
+                <w:color w:val="000000"/>
+                <w:sz w:val="19"/>
+              </w:rPr>
+              <w:t>Weight init zeros</w:t>
             </w:r>
           </w:p>
         </w:tc>
@@ -5360,6 +5662,7 @@
           <w:p>
             <w:r>
               <w:rPr>
+                <w:color w:val="000000"/>
                 <w:sz w:val="19"/>
               </w:rPr>
               <w:t>zeros</w:t>
@@ -5373,9 +5676,10 @@
           <w:p>
             <w:r>
               <w:rPr>
-                <w:sz w:val="19"/>
-              </w:rPr>
-              <w:t>43.6</w:t>
+                <w:color w:val="000000"/>
+                <w:sz w:val="19"/>
+              </w:rPr>
+              <w:t>43.60 s</w:t>
             </w:r>
           </w:p>
         </w:tc>
@@ -5386,6 +5690,7 @@
           <w:p>
             <w:r>
               <w:rPr>
+                <w:color w:val="000000"/>
                 <w:sz w:val="19"/>
               </w:rPr>
               <w:t>7078.1</w:t>
@@ -5399,6 +5704,7 @@
           <w:p>
             <w:r>
               <w:rPr>
+                <w:color w:val="000000"/>
                 <w:sz w:val="19"/>
               </w:rPr>
               <w:t>0.3431</w:t>
@@ -5412,9 +5718,10 @@
           <w:p>
             <w:r>
               <w:rPr>
-                <w:sz w:val="19"/>
-              </w:rPr>
-              <w:t>-</w:t>
+                <w:color w:val="000000"/>
+                <w:sz w:val="19"/>
+              </w:rPr>
+              <w:t>N/A</w:t>
             </w:r>
           </w:p>
         </w:tc>
@@ -5425,9 +5732,10 @@
           <w:p>
             <w:r>
               <w:rPr>
-                <w:sz w:val="19"/>
-              </w:rPr>
-              <w:t>-</w:t>
+                <w:color w:val="000000"/>
+                <w:sz w:val="19"/>
+              </w:rPr>
+              <w:t>N/A</w:t>
             </w:r>
           </w:p>
         </w:tc>
@@ -5438,9 +5746,10 @@
           <w:p>
             <w:r>
               <w:rPr>
-                <w:sz w:val="19"/>
-              </w:rPr>
-              <w:t>-</w:t>
+                <w:color w:val="000000"/>
+                <w:sz w:val="19"/>
+              </w:rPr>
+              <w:t>N/A</w:t>
             </w:r>
           </w:p>
         </w:tc>
@@ -5451,9 +5760,10 @@
           <w:p>
             <w:r>
               <w:rPr>
-                <w:sz w:val="19"/>
-              </w:rPr>
-              <w:t>-</w:t>
+                <w:color w:val="000000"/>
+                <w:sz w:val="19"/>
+              </w:rPr>
+              <w:t>N/A</w:t>
             </w:r>
           </w:p>
         </w:tc>
@@ -5466,9 +5776,10 @@
           <w:p>
             <w:r>
               <w:rPr>
-                <w:sz w:val="19"/>
-              </w:rPr>
-              <w:t>Activation checkpointing</w:t>
+                <w:color w:val="000000"/>
+                <w:sz w:val="19"/>
+              </w:rPr>
+              <w:t>Checkpointing</w:t>
             </w:r>
           </w:p>
         </w:tc>
@@ -5479,9 +5790,10 @@
           <w:p>
             <w:r>
               <w:rPr>
-                <w:sz w:val="19"/>
-              </w:rPr>
-              <w:t>no checkpointing</w:t>
+                <w:color w:val="000000"/>
+                <w:sz w:val="19"/>
+              </w:rPr>
+              <w:t>no checkpoint</w:t>
             </w:r>
           </w:p>
         </w:tc>
@@ -5492,9 +5804,10 @@
           <w:p>
             <w:r>
               <w:rPr>
-                <w:sz w:val="19"/>
-              </w:rPr>
-              <w:t>47.68</w:t>
+                <w:color w:val="000000"/>
+                <w:sz w:val="19"/>
+              </w:rPr>
+              <w:t>47.68 s</w:t>
             </w:r>
           </w:p>
         </w:tc>
@@ -5505,6 +5818,7 @@
           <w:p>
             <w:r>
               <w:rPr>
+                <w:color w:val="000000"/>
                 <w:sz w:val="19"/>
               </w:rPr>
               <w:t>7078.5</w:t>
@@ -5518,6 +5832,7 @@
           <w:p>
             <w:r>
               <w:rPr>
+                <w:color w:val="000000"/>
                 <w:sz w:val="19"/>
               </w:rPr>
               <w:t>0.6858</w:t>
@@ -5531,9 +5846,10 @@
           <w:p>
             <w:r>
               <w:rPr>
-                <w:sz w:val="19"/>
-              </w:rPr>
-              <w:t>with checkpointing</w:t>
+                <w:color w:val="000000"/>
+                <w:sz w:val="19"/>
+              </w:rPr>
+              <w:t>checkpoint</w:t>
             </w:r>
           </w:p>
         </w:tc>
@@ -5544,9 +5860,10 @@
           <w:p>
             <w:r>
               <w:rPr>
-                <w:sz w:val="19"/>
-              </w:rPr>
-              <w:t>52.39</w:t>
+                <w:color w:val="000000"/>
+                <w:sz w:val="19"/>
+              </w:rPr>
+              <w:t>52.39 s</w:t>
             </w:r>
           </w:p>
         </w:tc>
@@ -5557,6 +5874,7 @@
           <w:p>
             <w:r>
               <w:rPr>
+                <w:color w:val="000000"/>
                 <w:sz w:val="19"/>
               </w:rPr>
               <w:t>357.1</w:t>
@@ -5570,6 +5888,7 @@
           <w:p>
             <w:r>
               <w:rPr>
+                <w:color w:val="000000"/>
                 <w:sz w:val="19"/>
               </w:rPr>
               <w:t>0.6886</w:t>
@@ -5585,6 +5904,7 @@
           <w:p>
             <w:r>
               <w:rPr>
+                <w:color w:val="000000"/>
                 <w:sz w:val="19"/>
               </w:rPr>
               <w:t>Gradient accumulation</w:t>
@@ -5598,9 +5918,10 @@
           <w:p>
             <w:r>
               <w:rPr>
-                <w:sz w:val="19"/>
-              </w:rPr>
-              <w:t>baseline batch=64</w:t>
+                <w:color w:val="000000"/>
+                <w:sz w:val="19"/>
+              </w:rPr>
+              <w:t>batch 64</w:t>
             </w:r>
           </w:p>
         </w:tc>
@@ -5611,9 +5932,10 @@
           <w:p>
             <w:r>
               <w:rPr>
-                <w:sz w:val="19"/>
-              </w:rPr>
-              <w:t>37.29</w:t>
+                <w:color w:val="000000"/>
+                <w:sz w:val="19"/>
+              </w:rPr>
+              <w:t>37.29 s</w:t>
             </w:r>
           </w:p>
         </w:tc>
@@ -5624,6 +5946,7 @@
           <w:p>
             <w:r>
               <w:rPr>
+                <w:color w:val="000000"/>
                 <w:sz w:val="19"/>
               </w:rPr>
               <w:t>7078.9</w:t>
@@ -5637,6 +5960,7 @@
           <w:p>
             <w:r>
               <w:rPr>
+                <w:color w:val="000000"/>
                 <w:sz w:val="19"/>
               </w:rPr>
               <w:t>0.6858</w:t>
@@ -5650,9 +5974,10 @@
           <w:p>
             <w:r>
               <w:rPr>
-                <w:sz w:val="19"/>
-              </w:rPr>
-              <w:t>4x micro-batch=16</w:t>
+                <w:color w:val="000000"/>
+                <w:sz w:val="19"/>
+              </w:rPr>
+              <w:t>4x16 microbatch</w:t>
             </w:r>
           </w:p>
         </w:tc>
@@ -5663,9 +5988,10 @@
           <w:p>
             <w:r>
               <w:rPr>
-                <w:sz w:val="19"/>
-              </w:rPr>
-              <w:t>37.04</w:t>
+                <w:color w:val="000000"/>
+                <w:sz w:val="19"/>
+              </w:rPr>
+              <w:t>37.04 s</w:t>
             </w:r>
           </w:p>
         </w:tc>
@@ -5676,6 +6002,7 @@
           <w:p>
             <w:r>
               <w:rPr>
+                <w:color w:val="000000"/>
                 <w:sz w:val="19"/>
               </w:rPr>
               <w:t>1971.2</w:t>
@@ -5689,6 +6016,7 @@
           <w:p>
             <w:r>
               <w:rPr>
+                <w:color w:val="000000"/>
                 <w:sz w:val="19"/>
               </w:rPr>
               <w:t>0.6908</w:t>
@@ -5704,6 +6032,7 @@
           <w:p>
             <w:r>
               <w:rPr>
+                <w:color w:val="000000"/>
                 <w:sz w:val="19"/>
               </w:rPr>
               <w:t>Mixed precision</w:t>
@@ -5717,6 +6046,7 @@
           <w:p>
             <w:r>
               <w:rPr>
+                <w:color w:val="000000"/>
                 <w:sz w:val="19"/>
               </w:rPr>
               <w:t>fp32</w:t>
@@ -5730,9 +6060,10 @@
           <w:p>
             <w:r>
               <w:rPr>
-                <w:sz w:val="19"/>
-              </w:rPr>
-              <w:t>37.46</w:t>
+                <w:color w:val="000000"/>
+                <w:sz w:val="19"/>
+              </w:rPr>
+              <w:t>37.46 s</w:t>
             </w:r>
           </w:p>
         </w:tc>
@@ -5743,6 +6074,7 @@
           <w:p>
             <w:r>
               <w:rPr>
+                <w:color w:val="000000"/>
                 <w:sz w:val="19"/>
               </w:rPr>
               <w:t>7081.1</w:t>
@@ -5756,6 +6088,7 @@
           <w:p>
             <w:r>
               <w:rPr>
+                <w:color w:val="000000"/>
                 <w:sz w:val="19"/>
               </w:rPr>
               <w:t>0.6858</w:t>
@@ -5769,9 +6102,10 @@
           <w:p>
             <w:r>
               <w:rPr>
-                <w:sz w:val="19"/>
-              </w:rPr>
-              <w:t>fp16 autocast</w:t>
+                <w:color w:val="000000"/>
+                <w:sz w:val="19"/>
+              </w:rPr>
+              <w:t>fp16</w:t>
             </w:r>
           </w:p>
         </w:tc>
@@ -5782,9 +6116,10 @@
           <w:p>
             <w:r>
               <w:rPr>
-                <w:sz w:val="19"/>
-              </w:rPr>
-              <w:t>35.09</w:t>
+                <w:color w:val="000000"/>
+                <w:sz w:val="19"/>
+              </w:rPr>
+              <w:t>35.09 s</w:t>
             </w:r>
           </w:p>
         </w:tc>
@@ -5795,6 +6130,7 @@
           <w:p>
             <w:r>
               <w:rPr>
+                <w:color w:val="000000"/>
                 <w:sz w:val="19"/>
               </w:rPr>
               <w:t>5125.0</w:t>
@@ -5808,6 +6144,7 @@
           <w:p>
             <w:r>
               <w:rPr>
+                <w:color w:val="000000"/>
                 <w:sz w:val="19"/>
               </w:rPr>
               <w:t>0.6853</w:t>
@@ -5817,6 +6154,11 @@
       </w:tr>
     </w:tbl>
     <w:p/>
+    <w:p>
+      <w:r>
+        <w:t>Tensor placement, CPU vs GPU, gave the largest speedup. Weight init only changes the loss curve, not memory or time. Checkpointing and gradient accumulation both trade a small amount of time for a large memory saving. Mixed precision gives a smaller memory and speed gain on this hardware than it would on a CUDA GPU.</w:t>
+      </w:r>
+    </w:p>
     <w:tbl>
       <w:tblPr>
         <w:tblW w:type="auto" w:w="0"/>
@@ -5839,7 +6181,7 @@
           </w:tcPr>
           <w:p>
             <w:pPr>
-              <w:spacing w:before="360" w:after="360"/>
+              <w:spacing w:before="280" w:after="280"/>
               <w:jc w:val="center"/>
             </w:pPr>
             <w:r>
@@ -5850,18 +6192,13 @@
               </w:rPr>
               <w:t>[SCREENSHOT PLACEHOLDER]</w:t>
               <w:br/>
-              <w:t>Notebook cell output showing the final combined pandas summary table across all 5 techniques (Part 3, Summary section of the notebook).</w:t>
+              <w:t>Notebook cell showing the final summary table across all 5 techniques (Part 3, Summary section).</w:t>
             </w:r>
           </w:p>
         </w:tc>
       </w:tr>
     </w:tbl>
     <w:p/>
-    <w:p>
-      <w:r>
-        <w:t>Overall takeaways: tensor creation (CPU vs. GPU) is the foundational choice, since everything downstream runs on whichever device the tensors already live on, and it gave the largest single speedup of any technique tested. Weight initialization does not change memory or speed at all -- it only changes the starting point and shape of the loss curve, and residual architectures are forgiving of even pathological (all-zero) initialization in a way plain deep feedforward networks would not be. Activation checkpointing and gradient accumulation both trade a modest time/complexity cost for a large reduction in peak activation memory without changing what the model learns -- they are complementary techniques for fitting bigger models/batches into limited GPU memory. Mixed precision reduces memory and gives a modest speedup here; on CUDA hardware with Tensor Cores, the speedup is typically much larger.</w:t>
-      </w:r>
-    </w:p>
     <w:p>
       <w:pPr>
         <w:pStyle w:val="Heading1"/>
@@ -5872,7 +6209,7 @@
     </w:p>
     <w:p>
       <w:r>
-        <w:t>[TODO: fill in your own AI-use disclosure here, in the same format as assignments/assignment-1/AI_USE .md -- what you used AI for, one thing it got wrong, and how you checked the results yourself.]</w:t>
+        <w:t>[TODO: add your own AI use disclosure here, in the same format as assignments/assignment-1/AI_USE .md]</w:t>
       </w:r>
     </w:p>
     <w:sectPr>
@@ -6311,7 +6648,7 @@
       <w:rFonts w:asciiTheme="majorHAnsi" w:eastAsiaTheme="majorEastAsia" w:hAnsiTheme="majorHAnsi" w:cstheme="majorBidi"/>
       <w:b/>
       <w:bCs/>
-      <w:color w:val="365F91" w:themeColor="accent1" w:themeShade="BF"/>
+      <w:color w:val="000000"/>
       <w:sz w:val="28"/>
       <w:szCs w:val="28"/>
     </w:rPr>
@@ -6335,7 +6672,7 @@
       <w:rFonts w:asciiTheme="majorHAnsi" w:eastAsiaTheme="majorEastAsia" w:hAnsiTheme="majorHAnsi" w:cstheme="majorBidi"/>
       <w:b/>
       <w:bCs/>
-      <w:color w:val="4F81BD" w:themeColor="accent1"/>
+      <w:color w:val="000000"/>
       <w:sz w:val="26"/>
       <w:szCs w:val="26"/>
     </w:rPr>
@@ -6598,7 +6935,7 @@
     </w:pPr>
     <w:rPr>
       <w:rFonts w:asciiTheme="majorHAnsi" w:eastAsiaTheme="majorEastAsia" w:hAnsiTheme="majorHAnsi" w:cstheme="majorBidi"/>
-      <w:color w:val="17365D" w:themeColor="text2" w:themeShade="BF"/>
+      <w:color w:val="000000"/>
       <w:spacing w:val="5"/>
       <w:kern w:val="28"/>
       <w:sz w:val="52"/>

</xml_diff>

<commit_message>
Fix Word2Vec finetuning to be fully reproducible and sync report numbers
</commit_message>
<xml_diff>
--- a/assignments/assignment-2/HW2_Document.docx
+++ b/assignments/assignment-2/HW2_Document.docx
@@ -1187,7 +1187,7 @@
                 <w:color w:val="000000"/>
                 <w:sz w:val="19"/>
               </w:rPr>
-              <w:t>0.5975</w:t>
+              <w:t>0.5877</w:t>
             </w:r>
           </w:p>
         </w:tc>
@@ -1231,7 +1231,7 @@
                 <w:color w:val="000000"/>
                 <w:sz w:val="19"/>
               </w:rPr>
-              <w:t>ensemble</w:t>
+              <w:t>casts</w:t>
             </w:r>
           </w:p>
         </w:tc>
@@ -1245,7 +1245,7 @@
                 <w:color w:val="000000"/>
                 <w:sz w:val="19"/>
               </w:rPr>
-              <w:t>0.5629</w:t>
+              <w:t>0.5256</w:t>
             </w:r>
           </w:p>
         </w:tc>
@@ -1289,7 +1289,7 @@
                 <w:color w:val="000000"/>
                 <w:sz w:val="19"/>
               </w:rPr>
-              <w:t>casts</w:t>
+              <w:t>casted</w:t>
             </w:r>
           </w:p>
         </w:tc>
@@ -1303,7 +1303,7 @@
                 <w:color w:val="000000"/>
                 <w:sz w:val="19"/>
               </w:rPr>
-              <w:t>0.5266</w:t>
+              <w:t>0.5176</w:t>
             </w:r>
           </w:p>
         </w:tc>
@@ -1347,7 +1347,7 @@
                 <w:color w:val="000000"/>
                 <w:sz w:val="19"/>
               </w:rPr>
-              <w:t>ennio</w:t>
+              <w:t>morricone</w:t>
             </w:r>
           </w:p>
         </w:tc>
@@ -1361,7 +1361,7 @@
                 <w:color w:val="000000"/>
                 <w:sz w:val="19"/>
               </w:rPr>
-              <w:t>0.5714</w:t>
+              <w:t>0.6255</w:t>
             </w:r>
           </w:p>
         </w:tc>
@@ -1405,7 +1405,7 @@
                 <w:color w:val="000000"/>
                 <w:sz w:val="19"/>
               </w:rPr>
-              <w:t>morricone</w:t>
+              <w:t>ennio</w:t>
             </w:r>
           </w:p>
         </w:tc>
@@ -1419,7 +1419,7 @@
                 <w:color w:val="000000"/>
                 <w:sz w:val="19"/>
               </w:rPr>
-              <w:t>0.5708</w:t>
+              <w:t>0.6236</w:t>
             </w:r>
           </w:p>
         </w:tc>
@@ -1463,7 +1463,7 @@
                 <w:color w:val="000000"/>
                 <w:sz w:val="19"/>
               </w:rPr>
-              <w:t>scoring</w:t>
+              <w:t>steiner</w:t>
             </w:r>
           </w:p>
         </w:tc>
@@ -1477,7 +1477,7 @@
                 <w:color w:val="000000"/>
                 <w:sz w:val="19"/>
               </w:rPr>
-              <w:t>0.5438</w:t>
+              <w:t>0.5729</w:t>
             </w:r>
           </w:p>
         </w:tc>
@@ -1535,7 +1535,7 @@
                 <w:color w:val="000000"/>
                 <w:sz w:val="19"/>
               </w:rPr>
-              <w:t>0.6103</w:t>
+              <w:t>0.6344</w:t>
             </w:r>
           </w:p>
         </w:tc>
@@ -1593,7 +1593,7 @@
                 <w:color w:val="000000"/>
                 <w:sz w:val="19"/>
               </w:rPr>
-              <w:t>0.5662</w:t>
+              <w:t>0.6033</w:t>
             </w:r>
           </w:p>
         </w:tc>
@@ -1651,7 +1651,7 @@
                 <w:color w:val="000000"/>
                 <w:sz w:val="19"/>
               </w:rPr>
-              <w:t>0.5534</w:t>
+              <w:t>0.5834</w:t>
             </w:r>
           </w:p>
         </w:tc>
@@ -1709,7 +1709,7 @@
                 <w:color w:val="000000"/>
                 <w:sz w:val="19"/>
               </w:rPr>
-              <w:t>0.5327</w:t>
+              <w:t>0.5443</w:t>
             </w:r>
           </w:p>
         </w:tc>
@@ -1767,7 +1767,7 @@
                 <w:color w:val="000000"/>
                 <w:sz w:val="19"/>
               </w:rPr>
-              <w:t>0.5216</w:t>
+              <w:t>0.511</w:t>
             </w:r>
           </w:p>
         </w:tc>
@@ -1811,7 +1811,7 @@
                 <w:color w:val="000000"/>
                 <w:sz w:val="19"/>
               </w:rPr>
-              <w:t>kapadia</w:t>
+              <w:t>dreamkeeper</w:t>
             </w:r>
           </w:p>
         </w:tc>
@@ -1825,7 +1825,7 @@
                 <w:color w:val="000000"/>
                 <w:sz w:val="19"/>
               </w:rPr>
-              <w:t>0.3945</w:t>
+              <w:t>0.4186</w:t>
             </w:r>
           </w:p>
         </w:tc>
@@ -1869,7 +1869,7 @@
                 <w:color w:val="000000"/>
                 <w:sz w:val="19"/>
               </w:rPr>
-              <w:t>reviews</w:t>
+              <w:t>comments</w:t>
             </w:r>
           </w:p>
         </w:tc>
@@ -1883,7 +1883,7 @@
                 <w:color w:val="000000"/>
                 <w:sz w:val="19"/>
               </w:rPr>
-              <w:t>0.6052</w:t>
+              <w:t>0.5915</w:t>
             </w:r>
           </w:p>
         </w:tc>
@@ -1941,7 +1941,7 @@
                 <w:color w:val="000000"/>
                 <w:sz w:val="19"/>
               </w:rPr>
-              <w:t>0.5809</w:t>
+              <w:t>0.5869</w:t>
             </w:r>
           </w:p>
         </w:tc>
@@ -1985,7 +1985,7 @@
                 <w:color w:val="000000"/>
                 <w:sz w:val="19"/>
               </w:rPr>
-              <w:t>comments</w:t>
+              <w:t>reviews</w:t>
             </w:r>
           </w:p>
         </w:tc>
@@ -1999,7 +1999,7 @@
                 <w:color w:val="000000"/>
                 <w:sz w:val="19"/>
               </w:rPr>
-              <w:t>0.5578</w:t>
+              <w:t>0.58</w:t>
             </w:r>
           </w:p>
         </w:tc>
@@ -2008,7 +2008,7 @@
     <w:p/>
     <w:p>
       <w:r>
-        <w:t>Neighbors shift toward the film sense of each word after finetuning: cast toward supporting and ensemble, score toward ennio and morricone (the composer Ennio Morricone), plot toward story and storyline, and review toward reviews and comment. screen changes the least since it was already film related before finetuning.</w:t>
+        <w:t>Neighbors shift toward the film sense of each word after finetuning: cast toward supporting and casted, score toward morricone and ennio (real film composers Ennio Morricone and Max Steiner), plot toward story and storyline, and review toward comments and comment. screen changes the least since it was already film related before finetuning.</w:t>
       </w:r>
     </w:p>
     <w:tbl>
@@ -2228,7 +2228,7 @@
                 <w:color w:val="000000"/>
                 <w:sz w:val="19"/>
               </w:rPr>
-              <w:t>0.5757</w:t>
+              <w:t>0.547</w:t>
             </w:r>
           </w:p>
         </w:tc>
@@ -2258,7 +2258,7 @@
                 <w:color w:val="000000"/>
                 <w:sz w:val="19"/>
               </w:rPr>
-              <w:t>0.6441</w:t>
+              <w:t>0.6398</w:t>
             </w:r>
           </w:p>
         </w:tc>
@@ -2274,7 +2274,7 @@
                 <w:color w:val="000000"/>
                 <w:sz w:val="19"/>
               </w:rPr>
-              <w:t>screen</w:t>
+              <w:t>plot</w:t>
             </w:r>
           </w:p>
         </w:tc>
@@ -2288,7 +2288,7 @@
                 <w:color w:val="000000"/>
                 <w:sz w:val="19"/>
               </w:rPr>
-              <w:t>0.6652</w:t>
+              <w:t>0.6785</w:t>
             </w:r>
           </w:p>
         </w:tc>
@@ -2304,7 +2304,7 @@
                 <w:color w:val="000000"/>
                 <w:sz w:val="19"/>
               </w:rPr>
-              <w:t>plot</w:t>
+              <w:t>screen</w:t>
             </w:r>
           </w:p>
         </w:tc>
@@ -2318,7 +2318,7 @@
                 <w:color w:val="000000"/>
                 <w:sz w:val="19"/>
               </w:rPr>
-              <w:t>0.6738</w:t>
+              <w:t>0.6835</w:t>
             </w:r>
           </w:p>
         </w:tc>
@@ -2348,7 +2348,7 @@
                 <w:color w:val="000000"/>
                 <w:sz w:val="19"/>
               </w:rPr>
-              <w:t>0.6969</w:t>
+              <w:t>0.6972</w:t>
             </w:r>
           </w:p>
         </w:tc>
@@ -2357,12 +2357,12 @@
     <w:p/>
     <w:p>
       <w:r>
-        <w:t>Most shifted word: review (cosine similarity 0.5757). review has many general senses (performance review, code review) so the narrow IMDB usage pulls it furthest from its pretrained position.</w:t>
+        <w:t>Most shifted word: review (cosine similarity 0.5470). review has many general senses (performance review, code review) so the narrow IMDB usage pulls it furthest from its pretrained position.</w:t>
       </w:r>
     </w:p>
     <w:p>
       <w:r>
-        <w:t>Least shifted word: cast (cosine similarity 0.6969). cast already carries a strong film sense in general English, so IMDB usage reinforces rather than changes its meaning.</w:t>
+        <w:t>Least shifted word: cast (cosine similarity 0.6972). cast already carries a strong film sense in general English, so IMDB usage reinforces rather than changes its meaning.</w:t>
       </w:r>
     </w:p>
     <w:tbl>

</xml_diff>

<commit_message>
Sync Part 3 report numbers with the currently saved notebook run
</commit_message>
<xml_diff>
--- a/assignments/assignment-2/HW2_Document.docx
+++ b/assignments/assignment-2/HW2_Document.docx
@@ -2008,7 +2008,7 @@
     <w:p/>
     <w:p>
       <w:r>
-        <w:t>Neighbors shift toward the film sense of each word after finetuning: cast toward supporting and casted, score toward morricone and ennio (real film composers Ennio Morricone and Max Steiner), plot toward story and storyline, and review toward comments and comment. screen changes the least since it was already film related before finetuning.</w:t>
+        <w:t>Neighbors shift toward the film sense of each word after finetuning: cast toward supporting and casted, score toward morricone, ennio, and steiner (the film composers Ennio Morricone and Max Steiner), plot toward story and storyline, and review toward comments and comment. screen changes the least since it was already film related before finetuning.</w:t>
       </w:r>
     </w:p>
     <w:tbl>
@@ -3798,7 +3798,7 @@
                 <w:color w:val="000000"/>
                 <w:sz w:val="19"/>
               </w:rPr>
-              <w:t>67.63 s</w:t>
+              <w:t>55.99 s</w:t>
             </w:r>
           </w:p>
         </w:tc>
@@ -3812,7 +3812,7 @@
                 <w:color w:val="000000"/>
                 <w:sz w:val="19"/>
               </w:rPr>
-              <w:t>7783.9 MB</w:t>
+              <w:t>7783.0 MB</w:t>
             </w:r>
           </w:p>
         </w:tc>
@@ -3856,7 +3856,7 @@
                 <w:color w:val="000000"/>
                 <w:sz w:val="19"/>
               </w:rPr>
-              <w:t>32.82 s</w:t>
+              <w:t>22.62 s</w:t>
             </w:r>
           </w:p>
         </w:tc>
@@ -3893,7 +3893,7 @@
     <w:p/>
     <w:p>
       <w:r>
-        <w:t>MPS was 2.06 times faster than CPU for the same model, data, and steps. Final loss values are close, so both runs did the same computation on different hardware. The two memory numbers are not directly comparable: CPU memory is whole process memory, MPS memory is the allocator's live tensor count.</w:t>
+        <w:t>MPS was 2.47 times faster than CPU for the same model, data, and steps. Final loss values are close, so both runs did the same computation on different hardware. The two memory numbers are not directly comparable: CPU memory is whole process memory, MPS memory is the allocator's live tensor count.</w:t>
       </w:r>
     </w:p>
     <w:tbl>
@@ -4066,7 +4066,7 @@
                 <w:color w:val="000000"/>
                 <w:sz w:val="19"/>
               </w:rPr>
-              <w:t>42.87 s</w:t>
+              <w:t>22.64 s</w:t>
             </w:r>
           </w:p>
         </w:tc>
@@ -4080,7 +4080,7 @@
                 <w:color w:val="000000"/>
                 <w:sz w:val="19"/>
               </w:rPr>
-              <w:t>7077.4 MB</w:t>
+              <w:t>7077.7 MB</w:t>
             </w:r>
           </w:p>
         </w:tc>
@@ -4124,7 +4124,7 @@
                 <w:color w:val="000000"/>
                 <w:sz w:val="19"/>
               </w:rPr>
-              <w:t>43.19 s</w:t>
+              <w:t>22.61 s</w:t>
             </w:r>
           </w:p>
         </w:tc>
@@ -4138,7 +4138,7 @@
                 <w:color w:val="000000"/>
                 <w:sz w:val="19"/>
               </w:rPr>
-              <w:t>7079.1 MB</w:t>
+              <w:t>7078.2 MB</w:t>
             </w:r>
           </w:p>
         </w:tc>
@@ -4182,7 +4182,7 @@
                 <w:color w:val="000000"/>
                 <w:sz w:val="19"/>
               </w:rPr>
-              <w:t>43.60 s</w:t>
+              <w:t>22.58 s</w:t>
             </w:r>
           </w:p>
         </w:tc>
@@ -4196,7 +4196,7 @@
                 <w:color w:val="000000"/>
                 <w:sz w:val="19"/>
               </w:rPr>
-              <w:t>7078.1 MB</w:t>
+              <w:t>7078.8 MB</w:t>
             </w:r>
           </w:p>
         </w:tc>
@@ -4392,7 +4392,7 @@
                 <w:color w:val="000000"/>
                 <w:sz w:val="19"/>
               </w:rPr>
-              <w:t>47.68 s</w:t>
+              <w:t>22.70 s</w:t>
             </w:r>
           </w:p>
         </w:tc>
@@ -4406,7 +4406,7 @@
                 <w:color w:val="000000"/>
                 <w:sz w:val="19"/>
               </w:rPr>
-              <w:t>7078.5 MB</w:t>
+              <w:t>7079.4 MB</w:t>
             </w:r>
           </w:p>
         </w:tc>
@@ -4450,7 +4450,7 @@
                 <w:color w:val="000000"/>
                 <w:sz w:val="19"/>
               </w:rPr>
-              <w:t>52.39 s</w:t>
+              <w:t>31.71 s</w:t>
             </w:r>
           </w:p>
         </w:tc>
@@ -4464,7 +4464,7 @@
                 <w:color w:val="000000"/>
                 <w:sz w:val="19"/>
               </w:rPr>
-              <w:t>357.1 MB</w:t>
+              <w:t>359.6 MB</w:t>
             </w:r>
           </w:p>
         </w:tc>
@@ -4487,7 +4487,7 @@
     <w:p/>
     <w:p>
       <w:r>
-        <w:t>Checkpointing cuts peak activation memory by about 20 times, at the cost of about 10 percent more time, since checkpointed layers are recomputed during backward.</w:t>
+        <w:t>Checkpointing cuts peak activation memory by about 20 times, at the cost of about 40 percent more time, since checkpointed layers are recomputed during backward.</w:t>
       </w:r>
     </w:p>
     <w:tbl>
@@ -4668,7 +4668,7 @@
                 <w:color w:val="000000"/>
                 <w:sz w:val="19"/>
               </w:rPr>
-              <w:t>37.29 s</w:t>
+              <w:t>24.45 s</w:t>
             </w:r>
           </w:p>
         </w:tc>
@@ -4682,7 +4682,7 @@
                 <w:color w:val="000000"/>
                 <w:sz w:val="19"/>
               </w:rPr>
-              <w:t>7078.9 MB</w:t>
+              <w:t>7080.9 MB</w:t>
             </w:r>
           </w:p>
         </w:tc>
@@ -4726,7 +4726,7 @@
                 <w:color w:val="000000"/>
                 <w:sz w:val="19"/>
               </w:rPr>
-              <w:t>37.04 s</w:t>
+              <w:t>26.04 s</w:t>
             </w:r>
           </w:p>
         </w:tc>
@@ -4740,7 +4740,7 @@
                 <w:color w:val="000000"/>
                 <w:sz w:val="19"/>
               </w:rPr>
-              <w:t>1971.2 MB</w:t>
+              <w:t>1966.2 MB</w:t>
             </w:r>
           </w:p>
         </w:tc>
@@ -4763,7 +4763,7 @@
     <w:p/>
     <w:p>
       <w:r>
-        <w:t>Splitting the batch into 4 microbatches of 16 cuts peak memory by about 3.6 times, with almost no change in time and a nearly identical loss curve.</w:t>
+        <w:t>Splitting the batch into 4 microbatches of 16 cuts peak memory by about 3.6 times, with only a small change in time and a nearly identical loss curve.</w:t>
       </w:r>
     </w:p>
     <w:tbl>
@@ -4940,7 +4940,7 @@
                 <w:color w:val="000000"/>
                 <w:sz w:val="19"/>
               </w:rPr>
-              <w:t>37.46 s</w:t>
+              <w:t>26.00 s</w:t>
             </w:r>
           </w:p>
         </w:tc>
@@ -4954,7 +4954,7 @@
                 <w:color w:val="000000"/>
                 <w:sz w:val="19"/>
               </w:rPr>
-              <w:t>7081.1 MB</w:t>
+              <w:t>7077.9 MB</w:t>
             </w:r>
           </w:p>
         </w:tc>
@@ -4998,7 +4998,7 @@
                 <w:color w:val="000000"/>
                 <w:sz w:val="19"/>
               </w:rPr>
-              <w:t>35.09 s</w:t>
+              <w:t>22.97 s</w:t>
             </w:r>
           </w:p>
         </w:tc>
@@ -5012,7 +5012,7 @@
                 <w:color w:val="000000"/>
                 <w:sz w:val="19"/>
               </w:rPr>
-              <w:t>5125.0 MB</w:t>
+              <w:t>5123.8 MB</w:t>
             </w:r>
           </w:p>
         </w:tc>
@@ -5295,7 +5295,7 @@
                 <w:color w:val="000000"/>
                 <w:sz w:val="19"/>
               </w:rPr>
-              <w:t>67.63 s</w:t>
+              <w:t>55.99 s</w:t>
             </w:r>
           </w:p>
         </w:tc>
@@ -5309,7 +5309,7 @@
                 <w:color w:val="000000"/>
                 <w:sz w:val="19"/>
               </w:rPr>
-              <w:t>7783.9</w:t>
+              <w:t>7783.0</w:t>
             </w:r>
           </w:p>
         </w:tc>
@@ -5351,7 +5351,7 @@
                 <w:color w:val="000000"/>
                 <w:sz w:val="19"/>
               </w:rPr>
-              <w:t>32.82 s</w:t>
+              <w:t>22.62 s</w:t>
             </w:r>
           </w:p>
         </w:tc>
@@ -5423,7 +5423,7 @@
                 <w:color w:val="000000"/>
                 <w:sz w:val="19"/>
               </w:rPr>
-              <w:t>42.87 s</w:t>
+              <w:t>22.64 s</w:t>
             </w:r>
           </w:p>
         </w:tc>
@@ -5437,7 +5437,7 @@
                 <w:color w:val="000000"/>
                 <w:sz w:val="19"/>
               </w:rPr>
-              <w:t>7077.4</w:t>
+              <w:t>7077.7</w:t>
             </w:r>
           </w:p>
         </w:tc>
@@ -5551,7 +5551,7 @@
                 <w:color w:val="000000"/>
                 <w:sz w:val="19"/>
               </w:rPr>
-              <w:t>43.19 s</w:t>
+              <w:t>22.61 s</w:t>
             </w:r>
           </w:p>
         </w:tc>
@@ -5565,7 +5565,7 @@
                 <w:color w:val="000000"/>
                 <w:sz w:val="19"/>
               </w:rPr>
-              <w:t>7079.1</w:t>
+              <w:t>7078.2</w:t>
             </w:r>
           </w:p>
         </w:tc>
@@ -5679,7 +5679,7 @@
                 <w:color w:val="000000"/>
                 <w:sz w:val="19"/>
               </w:rPr>
-              <w:t>43.60 s</w:t>
+              <w:t>22.58 s</w:t>
             </w:r>
           </w:p>
         </w:tc>
@@ -5693,7 +5693,7 @@
                 <w:color w:val="000000"/>
                 <w:sz w:val="19"/>
               </w:rPr>
-              <w:t>7078.1</w:t>
+              <w:t>7078.8</w:t>
             </w:r>
           </w:p>
         </w:tc>
@@ -5807,7 +5807,7 @@
                 <w:color w:val="000000"/>
                 <w:sz w:val="19"/>
               </w:rPr>
-              <w:t>47.68 s</w:t>
+              <w:t>22.70 s</w:t>
             </w:r>
           </w:p>
         </w:tc>
@@ -5821,7 +5821,7 @@
                 <w:color w:val="000000"/>
                 <w:sz w:val="19"/>
               </w:rPr>
-              <w:t>7078.5</w:t>
+              <w:t>7079.4</w:t>
             </w:r>
           </w:p>
         </w:tc>
@@ -5863,7 +5863,7 @@
                 <w:color w:val="000000"/>
                 <w:sz w:val="19"/>
               </w:rPr>
-              <w:t>52.39 s</w:t>
+              <w:t>31.71 s</w:t>
             </w:r>
           </w:p>
         </w:tc>
@@ -5877,7 +5877,7 @@
                 <w:color w:val="000000"/>
                 <w:sz w:val="19"/>
               </w:rPr>
-              <w:t>357.1</w:t>
+              <w:t>359.6</w:t>
             </w:r>
           </w:p>
         </w:tc>
@@ -5935,7 +5935,7 @@
                 <w:color w:val="000000"/>
                 <w:sz w:val="19"/>
               </w:rPr>
-              <w:t>37.29 s</w:t>
+              <w:t>24.45 s</w:t>
             </w:r>
           </w:p>
         </w:tc>
@@ -5949,7 +5949,7 @@
                 <w:color w:val="000000"/>
                 <w:sz w:val="19"/>
               </w:rPr>
-              <w:t>7078.9</w:t>
+              <w:t>7080.9</w:t>
             </w:r>
           </w:p>
         </w:tc>
@@ -5991,7 +5991,7 @@
                 <w:color w:val="000000"/>
                 <w:sz w:val="19"/>
               </w:rPr>
-              <w:t>37.04 s</w:t>
+              <w:t>26.04 s</w:t>
             </w:r>
           </w:p>
         </w:tc>
@@ -6005,7 +6005,7 @@
                 <w:color w:val="000000"/>
                 <w:sz w:val="19"/>
               </w:rPr>
-              <w:t>1971.2</w:t>
+              <w:t>1966.2</w:t>
             </w:r>
           </w:p>
         </w:tc>
@@ -6063,7 +6063,7 @@
                 <w:color w:val="000000"/>
                 <w:sz w:val="19"/>
               </w:rPr>
-              <w:t>37.46 s</w:t>
+              <w:t>26.00 s</w:t>
             </w:r>
           </w:p>
         </w:tc>
@@ -6077,7 +6077,7 @@
                 <w:color w:val="000000"/>
                 <w:sz w:val="19"/>
               </w:rPr>
-              <w:t>7081.1</w:t>
+              <w:t>7077.9</w:t>
             </w:r>
           </w:p>
         </w:tc>
@@ -6119,7 +6119,7 @@
                 <w:color w:val="000000"/>
                 <w:sz w:val="19"/>
               </w:rPr>
-              <w:t>35.09 s</w:t>
+              <w:t>22.97 s</w:t>
             </w:r>
           </w:p>
         </w:tc>
@@ -6133,7 +6133,7 @@
                 <w:color w:val="000000"/>
                 <w:sz w:val="19"/>
               </w:rPr>
-              <w:t>5125.0</w:t>
+              <w:t>5123.8</w:t>
             </w:r>
           </w:p>
         </w:tc>

</xml_diff>